<commit_message>
update data surat nya
</commit_message>
<xml_diff>
--- a/assets/template/doc/template.docx
+++ b/assets/template/doc/template.docx
@@ -36,15 +36,7 @@
               <w:t xml:space="preserve">     </w:t>
             </w:r>
             <w:r>
-              <w:t>${</w:t>
-            </w:r>
-            <w:proofErr w:type="spellStart"/>
-            <w:r>
-              <w:t>CompanyLogo</w:t>
-            </w:r>
-            <w:proofErr w:type="spellEnd"/>
-            <w:r>
-              <w:t>}</w:t>
+              <w:t>${CompanyLogo}</w:t>
             </w:r>
             <w:r>
               <w:t xml:space="preserve">  </w:t>
@@ -141,75 +133,29 @@
                 <w:b/>
                 <w:bCs/>
               </w:rPr>
-              <w:t xml:space="preserve">Jalan </w:t>
-            </w:r>
-            <w:proofErr w:type="spellStart"/>
+              <w:t xml:space="preserve">Jalan diponegoro nomor </w:t>
+            </w:r>
             <w:r>
               <w:rPr>
                 <w:b/>
                 <w:bCs/>
               </w:rPr>
-              <w:t>diponegoro</w:t>
-            </w:r>
-            <w:proofErr w:type="spellEnd"/>
+              <w:t xml:space="preserve">, </w:t>
+            </w:r>
             <w:r>
               <w:rPr>
                 <w:b/>
                 <w:bCs/>
               </w:rPr>
-              <w:t xml:space="preserve"> </w:t>
-            </w:r>
-            <w:proofErr w:type="spellStart"/>
-            <w:r>
-              <w:rPr>
-                <w:b/>
-                <w:bCs/>
-              </w:rPr>
-              <w:t>nomor</w:t>
-            </w:r>
-            <w:proofErr w:type="spellEnd"/>
-            <w:r>
-              <w:rPr>
-                <w:b/>
-                <w:bCs/>
-              </w:rPr>
-              <w:t xml:space="preserve"> </w:t>
-            </w:r>
-            <w:r>
-              <w:rPr>
-                <w:b/>
-                <w:bCs/>
-              </w:rPr>
-              <w:t xml:space="preserve">, </w:t>
-            </w:r>
-            <w:r>
-              <w:rPr>
-                <w:b/>
-                <w:bCs/>
-              </w:rPr>
-              <w:t xml:space="preserve">20 </w:t>
-            </w:r>
-            <w:proofErr w:type="spellStart"/>
-            <w:r>
-              <w:rPr>
-                <w:b/>
-                <w:bCs/>
-              </w:rPr>
-              <w:t>sabang</w:t>
-            </w:r>
-            <w:proofErr w:type="spellEnd"/>
+              <w:t>20 sabang</w:t>
+            </w:r>
           </w:p>
           <w:p>
             <w:pPr>
               <w:jc w:val="center"/>
             </w:pPr>
-            <w:proofErr w:type="spellStart"/>
-            <w:r>
-              <w:t>Telepon</w:t>
-            </w:r>
-            <w:proofErr w:type="spellEnd"/>
-            <w:r>
-              <w:t xml:space="preserve"> (0852) 21040 fax (0657) 22202</w:t>
+            <w:r>
+              <w:t>Telepon (0852) 21040 fax (0657) 22202</w:t>
             </w:r>
           </w:p>
           <w:p>
@@ -338,19 +284,11 @@
           <w:lang w:eastAsia="ko-KR"/>
         </w:rPr>
       </w:pPr>
-      <w:proofErr w:type="spellStart"/>
-      <w:r>
-        <w:rPr>
-          <w:rFonts w:ascii="Arial" w:hAnsi="Arial" w:cs="Arial"/>
-        </w:rPr>
-        <w:t>Nomor</w:t>
-      </w:r>
-      <w:proofErr w:type="spellEnd"/>
-      <w:r>
-        <w:rPr>
-          <w:rFonts w:ascii="Arial" w:hAnsi="Arial" w:cs="Arial"/>
-        </w:rPr>
-        <w:t xml:space="preserve"> </w:t>
+      <w:r>
+        <w:rPr>
+          <w:rFonts w:ascii="Arial" w:hAnsi="Arial" w:cs="Arial"/>
+        </w:rPr>
+        <w:t xml:space="preserve">Nomor </w:t>
       </w:r>
       <w:r>
         <w:rPr>
@@ -366,7 +304,6 @@
         </w:rPr>
         <w:t>${</w:t>
       </w:r>
-      <w:proofErr w:type="spellStart"/>
       <w:r>
         <w:rPr>
           <w:b/>
@@ -397,76 +334,75 @@
           <w:bCs/>
           <w:color w:val="000000" w:themeColor="text1"/>
         </w:rPr>
-        <w:t>urat</w:t>
-      </w:r>
-      <w:proofErr w:type="spellEnd"/>
+        <w:t>urat}</w:t>
+      </w:r>
+    </w:p>
+    <w:p>
+      <w:pPr>
+        <w:jc w:val="center"/>
+        <w:rPr>
+          <w:rFonts w:ascii="Arial" w:hAnsi="Arial" w:cs="Arial"/>
+        </w:rPr>
+      </w:pPr>
+    </w:p>
+    <w:p>
+      <w:pPr>
+        <w:jc w:val="center"/>
+        <w:rPr>
+          <w:rFonts w:ascii="Arial" w:hAnsi="Arial" w:cs="Arial"/>
+        </w:rPr>
+      </w:pPr>
+    </w:p>
+    <w:p>
+      <w:pPr>
+        <w:pStyle w:val="BodyText"/>
+        <w:tabs>
+          <w:tab w:val="left" w:pos="993"/>
+          <w:tab w:val="left" w:pos="1276"/>
+        </w:tabs>
+        <w:snapToGrid w:val="0"/>
+        <w:spacing w:line="276" w:lineRule="auto"/>
+        <w:ind w:left="1276" w:hanging="1276"/>
+        <w:rPr>
+          <w:rFonts w:ascii="Arial" w:hAnsi="Arial" w:cs="Arial"/>
+          <w:b/>
+          <w:bCs/>
+          <w:lang w:eastAsia="ko-KR"/>
+        </w:rPr>
+      </w:pPr>
+      <w:r>
+        <w:rPr>
+          <w:rFonts w:ascii="Arial" w:hAnsi="Arial" w:cs="Arial"/>
+          <w:b/>
+          <w:bCs/>
+          <w:lang w:eastAsia="ko-KR"/>
+        </w:rPr>
+        <w:t>Dasar</w:t>
+      </w:r>
+      <w:r>
+        <w:rPr>
+          <w:rFonts w:ascii="Arial" w:hAnsi="Arial" w:cs="Arial"/>
+          <w:b/>
+          <w:bCs/>
+        </w:rPr>
+        <w:tab/>
+        <w:t>:</w:t>
+      </w:r>
+      <w:r>
+        <w:rPr>
+          <w:rFonts w:ascii="Arial" w:hAnsi="Arial" w:cs="Arial"/>
+          <w:b/>
+          <w:bCs/>
+        </w:rPr>
+        <w:tab/>
+      </w:r>
       <w:r>
         <w:rPr>
           <w:b/>
           <w:bCs/>
           <w:color w:val="000000" w:themeColor="text1"/>
         </w:rPr>
-        <w:t>}</w:t>
-      </w:r>
-    </w:p>
-    <w:p>
-      <w:pPr>
-        <w:jc w:val="center"/>
-        <w:rPr>
-          <w:rFonts w:ascii="Arial" w:hAnsi="Arial" w:cs="Arial"/>
-        </w:rPr>
-      </w:pPr>
-    </w:p>
-    <w:p>
-      <w:pPr>
-        <w:jc w:val="center"/>
-        <w:rPr>
-          <w:rFonts w:ascii="Arial" w:hAnsi="Arial" w:cs="Arial"/>
-        </w:rPr>
-      </w:pPr>
-    </w:p>
-    <w:p>
-      <w:pPr>
-        <w:pStyle w:val="BodyText"/>
-        <w:tabs>
-          <w:tab w:val="left" w:pos="993"/>
-          <w:tab w:val="left" w:pos="1276"/>
-        </w:tabs>
-        <w:snapToGrid w:val="0"/>
-        <w:spacing w:line="276" w:lineRule="auto"/>
-        <w:ind w:left="1276" w:hanging="1276"/>
-        <w:rPr>
-          <w:rFonts w:ascii="Arial" w:hAnsi="Arial" w:cs="Arial"/>
-          <w:b/>
-          <w:bCs/>
-          <w:lang w:eastAsia="ko-KR"/>
-        </w:rPr>
-      </w:pPr>
-      <w:r>
-        <w:rPr>
-          <w:rFonts w:ascii="Arial" w:hAnsi="Arial" w:cs="Arial"/>
-          <w:b/>
-          <w:bCs/>
-          <w:lang w:eastAsia="ko-KR"/>
-        </w:rPr>
-        <w:t>Dasar</w:t>
-      </w:r>
-      <w:r>
-        <w:rPr>
-          <w:rFonts w:ascii="Arial" w:hAnsi="Arial" w:cs="Arial"/>
-          <w:b/>
-          <w:bCs/>
-        </w:rPr>
-        <w:tab/>
-        <w:t>:</w:t>
-      </w:r>
-      <w:r>
-        <w:rPr>
-          <w:rFonts w:ascii="Arial" w:hAnsi="Arial" w:cs="Arial"/>
-          <w:b/>
-          <w:bCs/>
-        </w:rPr>
-        <w:tab/>
+        <w:t>${</w:t>
       </w:r>
       <w:r>
         <w:rPr>
@@ -474,7 +410,15 @@
           <w:bCs/>
           <w:color w:val="000000" w:themeColor="text1"/>
         </w:rPr>
-        <w:t>${purpose}</w:t>
+        <w:t>letter_subject</w:t>
+      </w:r>
+      <w:r>
+        <w:rPr>
+          <w:b/>
+          <w:bCs/>
+          <w:color w:val="000000" w:themeColor="text1"/>
+        </w:rPr>
+        <w:t>}</w:t>
       </w:r>
       <w:r>
         <w:rPr>
@@ -549,7 +493,6 @@
           <w:lang w:eastAsia="ko-KR"/>
         </w:rPr>
       </w:pPr>
-      <w:proofErr w:type="spellStart"/>
       <w:r>
         <w:rPr>
           <w:rFonts w:ascii="Arial" w:hAnsi="Arial" w:cs="Arial"/>
@@ -557,7 +500,6 @@
         </w:rPr>
         <w:t>Kepada</w:t>
       </w:r>
-      <w:proofErr w:type="spellEnd"/>
       <w:r>
         <w:rPr>
           <w:rFonts w:ascii="Arial" w:hAnsi="Arial" w:cs="Arial"/>
@@ -602,21 +544,7 @@
         <w:rPr>
           <w:color w:val="000000" w:themeColor="text1"/>
         </w:rPr>
-        <w:t>${</w:t>
-      </w:r>
-      <w:proofErr w:type="spellStart"/>
-      <w:r>
-        <w:rPr>
-          <w:color w:val="000000" w:themeColor="text1"/>
-        </w:rPr>
-        <w:t>block_name</w:t>
-      </w:r>
-      <w:proofErr w:type="spellEnd"/>
-      <w:r>
-        <w:rPr>
-          <w:color w:val="000000" w:themeColor="text1"/>
-        </w:rPr>
-        <w:t>}</w:t>
+        <w:t>${block_name}</w:t>
       </w:r>
     </w:p>
     <w:p>
@@ -720,21 +648,7 @@
         <w:rPr>
           <w:color w:val="000000" w:themeColor="text1"/>
         </w:rPr>
-        <w:t>: ${</w:t>
-      </w:r>
-      <w:proofErr w:type="spellStart"/>
-      <w:r>
-        <w:rPr>
-          <w:color w:val="000000" w:themeColor="text1"/>
-        </w:rPr>
-        <w:t>nama</w:t>
-      </w:r>
-      <w:proofErr w:type="spellEnd"/>
-      <w:r>
-        <w:rPr>
-          <w:color w:val="000000" w:themeColor="text1"/>
-        </w:rPr>
-        <w:t>}</w:t>
+        <w:t>: ${nama}</w:t>
       </w:r>
     </w:p>
     <w:p>
@@ -834,21 +748,7 @@
         <w:rPr>
           <w:color w:val="000000" w:themeColor="text1"/>
         </w:rPr>
-        <w:t xml:space="preserve">  </w:t>
-      </w:r>
-      <w:proofErr w:type="spellStart"/>
-      <w:r>
-        <w:rPr>
-          <w:color w:val="000000" w:themeColor="text1"/>
-        </w:rPr>
-        <w:t>Pangkat</w:t>
-      </w:r>
-      <w:proofErr w:type="spellEnd"/>
-      <w:r>
-        <w:rPr>
-          <w:color w:val="000000" w:themeColor="text1"/>
-        </w:rPr>
-        <w:t xml:space="preserve">/Gol.  </w:t>
+        <w:t xml:space="preserve">  Pangkat/Gol.  </w:t>
       </w:r>
       <w:r>
         <w:rPr>
@@ -871,7 +771,6 @@
         <w:t>${</w:t>
       </w:r>
       <w:bookmarkStart w:id="0" w:name="_Hlk71816749"/>
-      <w:proofErr w:type="spellStart"/>
       <w:r>
         <w:rPr>
           <w:color w:val="000000" w:themeColor="text1"/>
@@ -879,7 +778,6 @@
         <w:t>jabatan_pengikut</w:t>
       </w:r>
       <w:bookmarkEnd w:id="0"/>
-      <w:proofErr w:type="spellEnd"/>
       <w:r>
         <w:rPr>
           <w:color w:val="000000" w:themeColor="text1"/>
@@ -890,21 +788,7 @@
         <w:rPr>
           <w:color w:val="000000" w:themeColor="text1"/>
         </w:rPr>
-        <w:t xml:space="preserve"> /  ${</w:t>
-      </w:r>
-      <w:proofErr w:type="spellStart"/>
-      <w:r>
-        <w:rPr>
-          <w:color w:val="000000" w:themeColor="text1"/>
-        </w:rPr>
-        <w:t>golongan_pengikut</w:t>
-      </w:r>
-      <w:proofErr w:type="spellEnd"/>
-      <w:r>
-        <w:rPr>
-          <w:color w:val="000000" w:themeColor="text1"/>
-        </w:rPr>
-        <w:t>}</w:t>
+        <w:t xml:space="preserve"> /  ${golongan_pengikut}</w:t>
       </w:r>
     </w:p>
     <w:p>
@@ -935,16 +819,8 @@
         <w:rPr>
           <w:color w:val="000000" w:themeColor="text1"/>
         </w:rPr>
-        <w:t xml:space="preserve">  </w:t>
-      </w:r>
-      <w:proofErr w:type="spellStart"/>
-      <w:r>
-        <w:rPr>
-          <w:color w:val="000000" w:themeColor="text1"/>
-        </w:rPr>
-        <w:t>Jabatan</w:t>
-      </w:r>
-      <w:proofErr w:type="spellEnd"/>
+        <w:t xml:space="preserve">  Jabatan</w:t>
+      </w:r>
       <w:r>
         <w:rPr>
           <w:color w:val="000000" w:themeColor="text1"/>
@@ -963,21 +839,7 @@
           <w:color w:val="000000" w:themeColor="text1"/>
         </w:rPr>
         <w:tab/>
-        <w:t>: ${</w:t>
-      </w:r>
-      <w:proofErr w:type="spellStart"/>
-      <w:r>
-        <w:rPr>
-          <w:color w:val="000000" w:themeColor="text1"/>
-        </w:rPr>
-        <w:t>jabatan_pengikut</w:t>
-      </w:r>
-      <w:proofErr w:type="spellEnd"/>
-      <w:r>
-        <w:rPr>
-          <w:color w:val="000000" w:themeColor="text1"/>
-        </w:rPr>
-        <w:t>}</w:t>
+        <w:t>: ${jabatan_pengikut}</w:t>
       </w:r>
     </w:p>
     <w:p>
@@ -1008,21 +870,7 @@
         <w:rPr>
           <w:color w:val="000000" w:themeColor="text1"/>
         </w:rPr>
-        <w:t>${/</w:t>
-      </w:r>
-      <w:proofErr w:type="spellStart"/>
-      <w:r>
-        <w:rPr>
-          <w:color w:val="000000" w:themeColor="text1"/>
-        </w:rPr>
-        <w:t>block_name</w:t>
-      </w:r>
-      <w:proofErr w:type="spellEnd"/>
-      <w:r>
-        <w:rPr>
-          <w:color w:val="000000" w:themeColor="text1"/>
-        </w:rPr>
-        <w:t>}</w:t>
+        <w:t>${/block_name}</w:t>
       </w:r>
     </w:p>
     <w:p>
@@ -1070,7 +918,6 @@
           <w:lang w:eastAsia="ko-KR"/>
         </w:rPr>
       </w:pPr>
-      <w:proofErr w:type="spellStart"/>
       <w:r>
         <w:rPr>
           <w:rFonts w:ascii="Arial" w:hAnsi="Arial" w:cs="Arial"/>
@@ -1078,7 +925,6 @@
         </w:rPr>
         <w:t>Untuk</w:t>
       </w:r>
-      <w:proofErr w:type="spellEnd"/>
       <w:r>
         <w:rPr>
           <w:rFonts w:ascii="Arial" w:hAnsi="Arial" w:cs="Arial"/>
@@ -1101,15 +947,13 @@
         </w:rPr>
         <w:t>${</w:t>
       </w:r>
-      <w:proofErr w:type="spellStart"/>
-      <w:r>
-        <w:rPr>
-          <w:rFonts w:ascii="Arial" w:hAnsi="Arial" w:cs="Arial"/>
-          <w:lang w:eastAsia="ko-KR"/>
-        </w:rPr>
-        <w:t>letter_subject</w:t>
-      </w:r>
-      <w:proofErr w:type="spellEnd"/>
+      <w:r>
+        <w:rPr>
+          <w:rFonts w:ascii="Arial" w:hAnsi="Arial" w:cs="Arial"/>
+          <w:lang w:eastAsia="ko-KR"/>
+        </w:rPr>
+        <w:t>purpose</w:t>
+      </w:r>
       <w:r>
         <w:rPr>
           <w:rFonts w:ascii="Arial" w:hAnsi="Arial" w:cs="Arial"/>
@@ -1161,104 +1005,8 @@
           <w:lang w:eastAsia="ko-KR"/>
         </w:rPr>
         <w:tab/>
-      </w:r>
-      <w:proofErr w:type="spellStart"/>
-      <w:r>
-        <w:rPr>
-          <w:rFonts w:ascii="Arial" w:hAnsi="Arial" w:cs="Arial"/>
-          <w:lang w:eastAsia="ko-KR"/>
-        </w:rPr>
-        <w:t>Lamanya</w:t>
-      </w:r>
-      <w:proofErr w:type="spellEnd"/>
-      <w:r>
-        <w:rPr>
-          <w:rFonts w:ascii="Arial" w:hAnsi="Arial" w:cs="Arial"/>
-          <w:lang w:eastAsia="ko-KR"/>
-        </w:rPr>
-        <w:t xml:space="preserve"> </w:t>
-      </w:r>
-      <w:proofErr w:type="spellStart"/>
-      <w:r>
-        <w:rPr>
-          <w:rFonts w:ascii="Arial" w:hAnsi="Arial" w:cs="Arial"/>
-          <w:lang w:eastAsia="ko-KR"/>
-        </w:rPr>
-        <w:t>Perjalanan</w:t>
-      </w:r>
-      <w:proofErr w:type="spellEnd"/>
-      <w:r>
-        <w:rPr>
-          <w:rFonts w:ascii="Arial" w:hAnsi="Arial" w:cs="Arial"/>
-          <w:lang w:eastAsia="ko-KR"/>
-        </w:rPr>
-        <w:t xml:space="preserve"> </w:t>
-      </w:r>
-      <w:proofErr w:type="spellStart"/>
-      <w:r>
-        <w:rPr>
-          <w:rFonts w:ascii="Arial" w:hAnsi="Arial" w:cs="Arial"/>
-          <w:lang w:eastAsia="ko-KR"/>
-        </w:rPr>
-        <w:t>Dinas</w:t>
-      </w:r>
-      <w:proofErr w:type="spellEnd"/>
-      <w:r>
-        <w:rPr>
-          <w:rFonts w:ascii="Arial" w:hAnsi="Arial" w:cs="Arial"/>
-          <w:lang w:eastAsia="ko-KR"/>
-        </w:rPr>
-        <w:t xml:space="preserve"> </w:t>
-      </w:r>
-      <w:proofErr w:type="spellStart"/>
-      <w:r>
-        <w:rPr>
-          <w:rFonts w:ascii="Arial" w:hAnsi="Arial" w:cs="Arial"/>
-          <w:lang w:eastAsia="ko-KR"/>
-        </w:rPr>
-        <w:t>terhitung</w:t>
-      </w:r>
-      <w:proofErr w:type="spellEnd"/>
-      <w:r>
-        <w:rPr>
-          <w:rFonts w:ascii="Arial" w:hAnsi="Arial" w:cs="Arial"/>
-          <w:lang w:eastAsia="ko-KR"/>
-        </w:rPr>
-        <w:t xml:space="preserve"> </w:t>
-      </w:r>
-      <w:proofErr w:type="spellStart"/>
-      <w:r>
-        <w:rPr>
-          <w:rFonts w:ascii="Arial" w:hAnsi="Arial" w:cs="Arial"/>
-          <w:lang w:eastAsia="ko-KR"/>
-        </w:rPr>
-        <w:t>mulai</w:t>
-      </w:r>
-      <w:proofErr w:type="spellEnd"/>
-      <w:r>
-        <w:rPr>
-          <w:rFonts w:ascii="Arial" w:hAnsi="Arial" w:cs="Arial"/>
-          <w:lang w:eastAsia="ko-KR"/>
-        </w:rPr>
-        <w:t xml:space="preserve"> </w:t>
-      </w:r>
-      <w:proofErr w:type="spellStart"/>
-      <w:r>
-        <w:rPr>
-          <w:rFonts w:ascii="Arial" w:hAnsi="Arial" w:cs="Arial"/>
-          <w:lang w:eastAsia="ko-KR"/>
-        </w:rPr>
-        <w:t>tanggal</w:t>
-      </w:r>
-      <w:proofErr w:type="spellEnd"/>
-      <w:r>
-        <w:rPr>
-          <w:rFonts w:ascii="Arial" w:hAnsi="Arial" w:cs="Arial"/>
-          <w:lang w:eastAsia="ko-KR"/>
-        </w:rPr>
-        <w:t xml:space="preserve"> [</w:t>
-      </w:r>
-      <w:proofErr w:type="spellStart"/>
+        <w:t>Lamanya Perjalanan Dinas terhitung mulai tanggal [</w:t>
+      </w:r>
       <w:r>
         <w:rPr>
           <w:rFonts w:ascii="Arial" w:hAnsi="Arial" w:cs="Arial"/>
@@ -1273,47 +1021,13 @@
         </w:rPr>
         <w:t>berangkat</w:t>
       </w:r>
-      <w:proofErr w:type="spellEnd"/>
-      <w:r>
-        <w:rPr>
-          <w:rFonts w:ascii="Arial" w:hAnsi="Arial" w:cs="Arial"/>
-          <w:lang w:eastAsia="ko-KR"/>
-        </w:rPr>
-        <w:t xml:space="preserve">] </w:t>
-      </w:r>
-      <w:proofErr w:type="spellStart"/>
-      <w:r>
-        <w:rPr>
-          <w:rFonts w:ascii="Arial" w:hAnsi="Arial" w:cs="Arial"/>
-          <w:lang w:eastAsia="ko-KR"/>
-        </w:rPr>
-        <w:t>sampai</w:t>
-      </w:r>
-      <w:proofErr w:type="spellEnd"/>
-      <w:r>
-        <w:rPr>
-          <w:rFonts w:ascii="Arial" w:hAnsi="Arial" w:cs="Arial"/>
-          <w:lang w:eastAsia="ko-KR"/>
-        </w:rPr>
-        <w:t xml:space="preserve"> </w:t>
-      </w:r>
-      <w:proofErr w:type="spellStart"/>
-      <w:r>
-        <w:rPr>
-          <w:rFonts w:ascii="Arial" w:hAnsi="Arial" w:cs="Arial"/>
-          <w:lang w:eastAsia="ko-KR"/>
-        </w:rPr>
-        <w:t>dengan</w:t>
-      </w:r>
-      <w:proofErr w:type="spellEnd"/>
-      <w:r>
-        <w:rPr>
-          <w:rFonts w:ascii="Arial" w:hAnsi="Arial" w:cs="Arial"/>
-          <w:lang w:eastAsia="ko-KR"/>
-        </w:rPr>
-        <w:t xml:space="preserve"> [</w:t>
-      </w:r>
-      <w:proofErr w:type="spellStart"/>
+      <w:r>
+        <w:rPr>
+          <w:rFonts w:ascii="Arial" w:hAnsi="Arial" w:cs="Arial"/>
+          <w:lang w:eastAsia="ko-KR"/>
+        </w:rPr>
+        <w:t>] sampai dengan [</w:t>
+      </w:r>
       <w:r>
         <w:rPr>
           <w:rFonts w:ascii="Arial" w:hAnsi="Arial" w:cs="Arial"/>
@@ -1328,7 +1042,6 @@
         </w:rPr>
         <w:t>kembali</w:t>
       </w:r>
-      <w:proofErr w:type="spellEnd"/>
       <w:r>
         <w:rPr>
           <w:rFonts w:ascii="Arial" w:hAnsi="Arial" w:cs="Arial"/>
@@ -1367,21 +1080,12 @@
           <w:lang w:eastAsia="ko-KR"/>
         </w:rPr>
       </w:pPr>
-      <w:proofErr w:type="spellStart"/>
-      <w:r>
-        <w:rPr>
-          <w:rFonts w:ascii="Arial" w:hAnsi="Arial" w:cs="Arial"/>
-          <w:lang w:eastAsia="ko-KR"/>
-        </w:rPr>
-        <w:t>Dikeluarkan</w:t>
-      </w:r>
-      <w:proofErr w:type="spellEnd"/>
-      <w:r>
-        <w:rPr>
-          <w:rFonts w:ascii="Arial" w:hAnsi="Arial" w:cs="Arial"/>
-          <w:lang w:eastAsia="ko-KR"/>
-        </w:rPr>
-        <w:t xml:space="preserve"> di </w:t>
+      <w:r>
+        <w:rPr>
+          <w:rFonts w:ascii="Arial" w:hAnsi="Arial" w:cs="Arial"/>
+          <w:lang w:eastAsia="ko-KR"/>
+        </w:rPr>
+        <w:t xml:space="preserve">Dikeluarkan di </w:t>
       </w:r>
       <w:r>
         <w:rPr>
@@ -1391,15 +1095,7 @@
         <w:t xml:space="preserve"> </w:t>
       </w:r>
       <w:r>
-        <w:t>${</w:t>
-      </w:r>
-      <w:proofErr w:type="spellStart"/>
-      <w:r>
-        <w:t>daerah</w:t>
-      </w:r>
-      <w:proofErr w:type="spellEnd"/>
-      <w:r>
-        <w:t>}</w:t>
+        <w:t>${daerah}</w:t>
       </w:r>
     </w:p>
     <w:p>
@@ -1411,34 +1107,10 @@
           <w:rFonts w:ascii="Arial" w:hAnsi="Arial" w:cs="Arial"/>
           <w:lang w:eastAsia="ko-KR"/>
         </w:rPr>
-        <w:t xml:space="preserve">Pada </w:t>
-      </w:r>
-      <w:proofErr w:type="spellStart"/>
-      <w:r>
-        <w:rPr>
-          <w:rFonts w:ascii="Arial" w:hAnsi="Arial" w:cs="Arial"/>
-          <w:lang w:eastAsia="ko-KR"/>
-        </w:rPr>
-        <w:t>tanggal</w:t>
-      </w:r>
-      <w:proofErr w:type="spellEnd"/>
-      <w:r>
-        <w:rPr>
-          <w:rFonts w:ascii="Arial" w:hAnsi="Arial" w:cs="Arial"/>
-          <w:lang w:eastAsia="ko-KR"/>
-        </w:rPr>
-        <w:t xml:space="preserve"> </w:t>
-      </w:r>
-      <w:r>
-        <w:t>${</w:t>
-      </w:r>
-      <w:proofErr w:type="spellStart"/>
-      <w:r>
-        <w:t>tanggal</w:t>
-      </w:r>
-      <w:proofErr w:type="spellEnd"/>
-      <w:r>
-        <w:t>}</w:t>
+        <w:t xml:space="preserve">Pada tanggal </w:t>
+      </w:r>
+      <w:r>
+        <w:t>${tanggal}</w:t>
       </w:r>
     </w:p>
     <w:p>
@@ -1460,15 +1132,7 @@
           <w:rFonts w:ascii="Arial" w:hAnsi="Arial" w:cs="Arial"/>
           <w:lang w:eastAsia="ko-KR"/>
         </w:rPr>
-        <w:t>[</w:t>
-      </w:r>
-      <w:proofErr w:type="spellStart"/>
-      <w:r>
-        <w:rPr>
-          <w:rFonts w:ascii="Arial" w:hAnsi="Arial" w:cs="Arial"/>
-          <w:lang w:eastAsia="ko-KR"/>
-        </w:rPr>
-        <w:t>penandatangan</w:t>
+        <w:t>[penandatangan</w:t>
       </w:r>
       <w:r>
         <w:rPr>
@@ -1477,7 +1141,6 @@
         </w:rPr>
         <w:t>_spt</w:t>
       </w:r>
-      <w:proofErr w:type="spellEnd"/>
       <w:r>
         <w:rPr>
           <w:rFonts w:ascii="Arial" w:hAnsi="Arial" w:cs="Arial"/>
@@ -1550,15 +1213,7 @@
           <w:rFonts w:ascii="Arial" w:hAnsi="Arial" w:cs="Arial"/>
           <w:lang w:eastAsia="ko-KR"/>
         </w:rPr>
-        <w:t>[</w:t>
-      </w:r>
-      <w:proofErr w:type="spellStart"/>
-      <w:r>
-        <w:rPr>
-          <w:rFonts w:ascii="Arial" w:hAnsi="Arial" w:cs="Arial"/>
-          <w:lang w:eastAsia="ko-KR"/>
-        </w:rPr>
-        <w:t>nama</w:t>
+        <w:t>[nama</w:t>
       </w:r>
       <w:r>
         <w:rPr>
@@ -1566,7 +1221,6 @@
         </w:rPr>
         <w:t>_pemberi_tugas</w:t>
       </w:r>
-      <w:proofErr w:type="spellEnd"/>
       <w:r>
         <w:rPr>
           <w:rFonts w:ascii="Arial" w:hAnsi="Arial" w:cs="Arial"/>
@@ -1594,15 +1248,7 @@
           <w:rFonts w:ascii="Arial" w:hAnsi="Arial" w:cs="Arial"/>
           <w:lang w:eastAsia="ko-KR"/>
         </w:rPr>
-        <w:t>[</w:t>
-      </w:r>
-      <w:proofErr w:type="spellStart"/>
-      <w:r>
-        <w:rPr>
-          <w:rFonts w:ascii="Arial" w:hAnsi="Arial" w:cs="Arial"/>
-          <w:lang w:eastAsia="ko-KR"/>
-        </w:rPr>
-        <w:t>pangkat</w:t>
+        <w:t>[pangkat</w:t>
       </w:r>
       <w:r>
         <w:rPr>
@@ -1610,7 +1256,6 @@
         </w:rPr>
         <w:t>_pemberi_tugas</w:t>
       </w:r>
-      <w:proofErr w:type="spellEnd"/>
       <w:r>
         <w:rPr>
           <w:rFonts w:ascii="Arial" w:hAnsi="Arial" w:cs="Arial"/>
@@ -1640,7 +1285,6 @@
         </w:rPr>
         <w:t>NIP. [</w:t>
       </w:r>
-      <w:proofErr w:type="spellStart"/>
       <w:r>
         <w:rPr>
           <w:rFonts w:ascii="Arial" w:hAnsi="Arial" w:cs="Arial"/>
@@ -1648,7 +1292,6 @@
         </w:rPr>
         <w:t>no_nip</w:t>
       </w:r>
-      <w:proofErr w:type="spellEnd"/>
       <w:r>
         <w:rPr>
           <w:rFonts w:ascii="Arial" w:hAnsi="Arial" w:cs="Arial"/>
@@ -1680,7 +1323,6 @@
         </w:rPr>
         <w:t>SP. [</w:t>
       </w:r>
-      <w:proofErr w:type="spellStart"/>
       <w:r>
         <w:rPr>
           <w:rFonts w:ascii="Arial" w:hAnsi="Arial" w:cs="Arial"/>
@@ -1688,7 +1330,6 @@
         </w:rPr>
         <w:t>no_sp</w:t>
       </w:r>
-      <w:proofErr w:type="spellEnd"/>
       <w:r>
         <w:rPr>
           <w:rFonts w:ascii="Arial" w:hAnsi="Arial" w:cs="Arial"/>
@@ -1716,7 +1357,6 @@
         </w:rPr>
         <w:t xml:space="preserve">SP. </w:t>
       </w:r>
-      <w:proofErr w:type="spellStart"/>
       <w:r>
         <w:rPr>
           <w:rFonts w:ascii="Arial" w:hAnsi="Arial" w:cs="Arial"/>
@@ -1725,84 +1365,7 @@
           <w:szCs w:val="20"/>
           <w:lang w:eastAsia="ko-KR"/>
         </w:rPr>
-        <w:t>akan</w:t>
-      </w:r>
-      <w:proofErr w:type="spellEnd"/>
-      <w:r>
-        <w:rPr>
-          <w:rFonts w:ascii="Arial" w:hAnsi="Arial" w:cs="Arial"/>
-          <w:color w:val="FF0000"/>
-          <w:sz w:val="20"/>
-          <w:szCs w:val="20"/>
-          <w:lang w:eastAsia="ko-KR"/>
-        </w:rPr>
-        <w:t xml:space="preserve"> </w:t>
-      </w:r>
-      <w:proofErr w:type="spellStart"/>
-      <w:r>
-        <w:rPr>
-          <w:rFonts w:ascii="Arial" w:hAnsi="Arial" w:cs="Arial"/>
-          <w:color w:val="FF0000"/>
-          <w:sz w:val="20"/>
-          <w:szCs w:val="20"/>
-          <w:lang w:eastAsia="ko-KR"/>
-        </w:rPr>
-        <w:t>muncul</w:t>
-      </w:r>
-      <w:proofErr w:type="spellEnd"/>
-      <w:r>
-        <w:rPr>
-          <w:rFonts w:ascii="Arial" w:hAnsi="Arial" w:cs="Arial"/>
-          <w:color w:val="FF0000"/>
-          <w:sz w:val="20"/>
-          <w:szCs w:val="20"/>
-          <w:lang w:eastAsia="ko-KR"/>
-        </w:rPr>
-        <w:t xml:space="preserve"> </w:t>
-      </w:r>
-      <w:proofErr w:type="spellStart"/>
-      <w:r>
-        <w:rPr>
-          <w:rFonts w:ascii="Arial" w:hAnsi="Arial" w:cs="Arial"/>
-          <w:color w:val="FF0000"/>
-          <w:sz w:val="20"/>
-          <w:szCs w:val="20"/>
-          <w:lang w:eastAsia="ko-KR"/>
-        </w:rPr>
-        <w:t>jika</w:t>
-      </w:r>
-      <w:proofErr w:type="spellEnd"/>
-      <w:r>
-        <w:rPr>
-          <w:rFonts w:ascii="Arial" w:hAnsi="Arial" w:cs="Arial"/>
-          <w:color w:val="FF0000"/>
-          <w:sz w:val="20"/>
-          <w:szCs w:val="20"/>
-          <w:lang w:eastAsia="ko-KR"/>
-        </w:rPr>
-        <w:t xml:space="preserve"> </w:t>
-      </w:r>
-      <w:proofErr w:type="spellStart"/>
-      <w:r>
-        <w:rPr>
-          <w:rFonts w:ascii="Arial" w:hAnsi="Arial" w:cs="Arial"/>
-          <w:color w:val="FF0000"/>
-          <w:sz w:val="20"/>
-          <w:szCs w:val="20"/>
-          <w:lang w:eastAsia="ko-KR"/>
-        </w:rPr>
-        <w:t>diperlukan</w:t>
-      </w:r>
-      <w:proofErr w:type="spellEnd"/>
-      <w:r>
-        <w:rPr>
-          <w:rFonts w:ascii="Arial" w:hAnsi="Arial" w:cs="Arial"/>
-          <w:color w:val="FF0000"/>
-          <w:sz w:val="20"/>
-          <w:szCs w:val="20"/>
-          <w:lang w:eastAsia="ko-KR"/>
-        </w:rPr>
-        <w:t>)</w:t>
+        <w:t>akan muncul jika diperlukan)</w:t>
       </w:r>
     </w:p>
     <w:p>
@@ -2095,15 +1658,7 @@
               <w:t xml:space="preserve">     </w:t>
             </w:r>
             <w:r>
-              <w:t>${</w:t>
-            </w:r>
-            <w:proofErr w:type="spellStart"/>
-            <w:r>
-              <w:t>CompanyLogo</w:t>
-            </w:r>
-            <w:proofErr w:type="spellEnd"/>
-            <w:r>
-              <w:t>}</w:t>
+              <w:t>${CompanyLogo}</w:t>
             </w:r>
             <w:r>
               <w:t xml:space="preserve">  </w:t>
@@ -2200,75 +1755,29 @@
                 <w:b/>
                 <w:bCs/>
               </w:rPr>
-              <w:t xml:space="preserve">Jalan </w:t>
-            </w:r>
-            <w:proofErr w:type="spellStart"/>
+              <w:t xml:space="preserve">Jalan diponegoro nomor </w:t>
+            </w:r>
             <w:r>
               <w:rPr>
                 <w:b/>
                 <w:bCs/>
               </w:rPr>
-              <w:t>diponegoro</w:t>
-            </w:r>
-            <w:proofErr w:type="spellEnd"/>
+              <w:t xml:space="preserve">, </w:t>
+            </w:r>
             <w:r>
               <w:rPr>
                 <w:b/>
                 <w:bCs/>
               </w:rPr>
-              <w:t xml:space="preserve"> </w:t>
-            </w:r>
-            <w:proofErr w:type="spellStart"/>
-            <w:r>
-              <w:rPr>
-                <w:b/>
-                <w:bCs/>
-              </w:rPr>
-              <w:t>nomor</w:t>
-            </w:r>
-            <w:proofErr w:type="spellEnd"/>
-            <w:r>
-              <w:rPr>
-                <w:b/>
-                <w:bCs/>
-              </w:rPr>
-              <w:t xml:space="preserve"> </w:t>
-            </w:r>
-            <w:r>
-              <w:rPr>
-                <w:b/>
-                <w:bCs/>
-              </w:rPr>
-              <w:t xml:space="preserve">, </w:t>
-            </w:r>
-            <w:r>
-              <w:rPr>
-                <w:b/>
-                <w:bCs/>
-              </w:rPr>
-              <w:t xml:space="preserve">20 </w:t>
-            </w:r>
-            <w:proofErr w:type="spellStart"/>
-            <w:r>
-              <w:rPr>
-                <w:b/>
-                <w:bCs/>
-              </w:rPr>
-              <w:t>sabang</w:t>
-            </w:r>
-            <w:proofErr w:type="spellEnd"/>
+              <w:t>20 sabang</w:t>
+            </w:r>
           </w:p>
           <w:p>
             <w:pPr>
               <w:jc w:val="center"/>
             </w:pPr>
-            <w:proofErr w:type="spellStart"/>
-            <w:r>
-              <w:t>Telepon</w:t>
-            </w:r>
-            <w:proofErr w:type="spellEnd"/>
-            <w:r>
-              <w:t xml:space="preserve"> (0852) 21040 fax (0657) 22202</w:t>
+            <w:r>
+              <w:t>Telepon (0852) 21040 fax (0657) 22202</w:t>
             </w:r>
           </w:p>
           <w:p>
@@ -2402,7 +1911,6 @@
           <w:lang w:eastAsia="ko-KR"/>
         </w:rPr>
       </w:pPr>
-      <w:proofErr w:type="spellStart"/>
       <w:r>
         <w:rPr>
           <w:rFonts w:ascii="Arial" w:hAnsi="Arial" w:cs="Arial"/>
@@ -2410,7 +1918,6 @@
         </w:rPr>
         <w:t>Nomor</w:t>
       </w:r>
-      <w:proofErr w:type="spellEnd"/>
       <w:r>
         <w:rPr>
           <w:rFonts w:ascii="Arial" w:hAnsi="Arial" w:cs="Arial"/>
@@ -2431,23 +1938,7 @@
           <w:rFonts w:ascii="Arial" w:hAnsi="Arial" w:cs="Arial"/>
           <w:lang w:eastAsia="ko-KR"/>
         </w:rPr>
-        <w:t>[</w:t>
-      </w:r>
-      <w:proofErr w:type="spellStart"/>
-      <w:r>
-        <w:rPr>
-          <w:rFonts w:ascii="Arial" w:hAnsi="Arial" w:cs="Arial"/>
-          <w:lang w:eastAsia="ko-KR"/>
-        </w:rPr>
-        <w:t>no_surat_sppd</w:t>
-      </w:r>
-      <w:proofErr w:type="spellEnd"/>
-      <w:r>
-        <w:rPr>
-          <w:rFonts w:ascii="Arial" w:hAnsi="Arial" w:cs="Arial"/>
-          <w:lang w:eastAsia="ko-KR"/>
-        </w:rPr>
-        <w:t>]</w:t>
+        <w:t>[no_surat_sppd]</w:t>
       </w:r>
     </w:p>
     <w:p>
@@ -2471,17 +1962,8 @@
           <w:rFonts w:ascii="Arial" w:hAnsi="Arial" w:cs="Arial"/>
           <w:lang w:eastAsia="ko-KR"/>
         </w:rPr>
-        <w:t xml:space="preserve">Lembar </w:t>
-      </w:r>
-      <w:proofErr w:type="spellStart"/>
-      <w:r>
-        <w:rPr>
-          <w:rFonts w:ascii="Arial" w:hAnsi="Arial" w:cs="Arial"/>
-          <w:lang w:eastAsia="ko-KR"/>
-        </w:rPr>
-        <w:t>ke</w:t>
-      </w:r>
-      <w:proofErr w:type="spellEnd"/>
+        <w:t>Lembar ke</w:t>
+      </w:r>
       <w:r>
         <w:rPr>
           <w:rFonts w:ascii="Arial" w:hAnsi="Arial" w:cs="Arial"/>
@@ -2616,56 +2098,12 @@
                 <w:rFonts w:ascii="Arial" w:hAnsi="Arial" w:cs="Arial"/>
               </w:rPr>
             </w:pPr>
-            <w:proofErr w:type="spellStart"/>
-            <w:r>
-              <w:rPr>
-                <w:rFonts w:ascii="Arial" w:hAnsi="Arial" w:cs="Arial"/>
-              </w:rPr>
-              <w:t>Pejabat</w:t>
-            </w:r>
-            <w:proofErr w:type="spellEnd"/>
-            <w:r>
-              <w:rPr>
-                <w:rFonts w:ascii="Arial" w:hAnsi="Arial" w:cs="Arial"/>
-              </w:rPr>
-              <w:t xml:space="preserve"> </w:t>
-            </w:r>
-            <w:proofErr w:type="spellStart"/>
-            <w:r>
-              <w:rPr>
-                <w:rFonts w:ascii="Arial" w:hAnsi="Arial" w:cs="Arial"/>
-              </w:rPr>
-              <w:t>berwenang</w:t>
-            </w:r>
-            <w:proofErr w:type="spellEnd"/>
-            <w:r>
-              <w:rPr>
-                <w:rFonts w:ascii="Arial" w:hAnsi="Arial" w:cs="Arial"/>
-              </w:rPr>
-              <w:t xml:space="preserve"> yang </w:t>
-            </w:r>
-            <w:proofErr w:type="spellStart"/>
-            <w:r>
-              <w:rPr>
-                <w:rFonts w:ascii="Arial" w:hAnsi="Arial" w:cs="Arial"/>
-              </w:rPr>
-              <w:t>memberi</w:t>
-            </w:r>
-            <w:proofErr w:type="spellEnd"/>
-            <w:r>
-              <w:rPr>
-                <w:rFonts w:ascii="Arial" w:hAnsi="Arial" w:cs="Arial"/>
-              </w:rPr>
-              <w:t xml:space="preserve"> </w:t>
-            </w:r>
-            <w:proofErr w:type="spellStart"/>
-            <w:r>
-              <w:rPr>
-                <w:rFonts w:ascii="Arial" w:hAnsi="Arial" w:cs="Arial"/>
-              </w:rPr>
-              <w:t>perintah</w:t>
-            </w:r>
-            <w:proofErr w:type="spellEnd"/>
+            <w:r>
+              <w:rPr>
+                <w:rFonts w:ascii="Arial" w:hAnsi="Arial" w:cs="Arial"/>
+              </w:rPr>
+              <w:t>Pejabat berwenang yang memberi perintah</w:t>
+            </w:r>
             <w:r>
               <w:rPr>
                 <w:rFonts w:ascii="Arial" w:hAnsi="Arial" w:cs="Arial"/>
@@ -2685,25 +2123,7 @@
                 <w:bCs/>
                 <w:color w:val="000000" w:themeColor="text1"/>
               </w:rPr>
-              <w:t>${</w:t>
-            </w:r>
-            <w:proofErr w:type="spellStart"/>
-            <w:r>
-              <w:rPr>
-                <w:b/>
-                <w:bCs/>
-                <w:color w:val="000000" w:themeColor="text1"/>
-              </w:rPr>
-              <w:t>nama_pemberi</w:t>
-            </w:r>
-            <w:proofErr w:type="spellEnd"/>
-            <w:r>
-              <w:rPr>
-                <w:b/>
-                <w:bCs/>
-                <w:color w:val="000000" w:themeColor="text1"/>
-              </w:rPr>
-              <w:t>}</w:t>
+              <w:t>${nama_pemberi}</w:t>
             </w:r>
           </w:p>
         </w:tc>
@@ -2737,30 +2157,8 @@
               <w:rPr>
                 <w:rFonts w:ascii="Arial" w:hAnsi="Arial" w:cs="Arial"/>
               </w:rPr>
-              <w:t xml:space="preserve">Nama / NIP </w:t>
-            </w:r>
-            <w:proofErr w:type="spellStart"/>
-            <w:r>
-              <w:rPr>
-                <w:rFonts w:ascii="Arial" w:hAnsi="Arial" w:cs="Arial"/>
-              </w:rPr>
-              <w:t>Pegawai</w:t>
-            </w:r>
-            <w:proofErr w:type="spellEnd"/>
-            <w:r>
-              <w:rPr>
-                <w:rFonts w:ascii="Arial" w:hAnsi="Arial" w:cs="Arial"/>
-              </w:rPr>
-              <w:t xml:space="preserve"> yang </w:t>
-            </w:r>
-            <w:proofErr w:type="spellStart"/>
-            <w:r>
-              <w:rPr>
-                <w:rFonts w:ascii="Arial" w:hAnsi="Arial" w:cs="Arial"/>
-              </w:rPr>
-              <w:t>diperintah</w:t>
-            </w:r>
-            <w:proofErr w:type="spellEnd"/>
+              <w:t>Nama / NIP Pegawai yang diperintah</w:t>
+            </w:r>
             <w:r>
               <w:rPr>
                 <w:rFonts w:ascii="Arial" w:hAnsi="Arial" w:cs="Arial"/>
@@ -2780,25 +2178,7 @@
                 <w:bCs/>
                 <w:color w:val="000000" w:themeColor="text1"/>
               </w:rPr>
-              <w:t>${</w:t>
-            </w:r>
-            <w:proofErr w:type="spellStart"/>
-            <w:r>
-              <w:rPr>
-                <w:b/>
-                <w:bCs/>
-                <w:color w:val="000000" w:themeColor="text1"/>
-              </w:rPr>
-              <w:t>nama_diperintah</w:t>
-            </w:r>
-            <w:proofErr w:type="spellEnd"/>
-            <w:r>
-              <w:rPr>
-                <w:b/>
-                <w:bCs/>
-                <w:color w:val="000000" w:themeColor="text1"/>
-              </w:rPr>
-              <w:t xml:space="preserve">} </w:t>
+              <w:t xml:space="preserve">${nama_diperintah} </w:t>
             </w:r>
           </w:p>
           <w:p>
@@ -2832,21 +2212,7 @@
               <w:rPr>
                 <w:rFonts w:ascii="Arial" w:hAnsi="Arial" w:cs="Arial"/>
               </w:rPr>
-              <w:t>${</w:t>
-            </w:r>
-            <w:proofErr w:type="spellStart"/>
-            <w:r>
-              <w:rPr>
-                <w:rFonts w:ascii="Arial" w:hAnsi="Arial" w:cs="Arial"/>
-              </w:rPr>
-              <w:t>nik_pimpinan</w:t>
-            </w:r>
-            <w:proofErr w:type="spellEnd"/>
-            <w:r>
-              <w:rPr>
-                <w:rFonts w:ascii="Arial" w:hAnsi="Arial" w:cs="Arial"/>
-              </w:rPr>
-              <w:t>}</w:t>
+              <w:t>${nik_pimpinan}</w:t>
             </w:r>
           </w:p>
         </w:tc>
@@ -2880,16 +2246,8 @@
               <w:rPr>
                 <w:rFonts w:ascii="Arial" w:hAnsi="Arial" w:cs="Arial"/>
               </w:rPr>
-              <w:t xml:space="preserve">a. </w:t>
-            </w:r>
-            <w:proofErr w:type="spellStart"/>
-            <w:r>
-              <w:rPr>
-                <w:rFonts w:ascii="Arial" w:hAnsi="Arial" w:cs="Arial"/>
-              </w:rPr>
-              <w:t>Jabatan</w:t>
-            </w:r>
-            <w:proofErr w:type="spellEnd"/>
+              <w:t>a. Jabatan</w:t>
+            </w:r>
             <w:r>
               <w:rPr>
                 <w:rFonts w:ascii="Arial" w:hAnsi="Arial" w:cs="Arial"/>
@@ -2909,25 +2267,7 @@
                 <w:bCs/>
                 <w:color w:val="000000" w:themeColor="text1"/>
               </w:rPr>
-              <w:t>${</w:t>
-            </w:r>
-            <w:proofErr w:type="spellStart"/>
-            <w:r>
-              <w:rPr>
-                <w:b/>
-                <w:bCs/>
-                <w:color w:val="000000" w:themeColor="text1"/>
-              </w:rPr>
-              <w:t>jabatan_pimpinan</w:t>
-            </w:r>
-            <w:proofErr w:type="spellEnd"/>
-            <w:r>
-              <w:rPr>
-                <w:b/>
-                <w:bCs/>
-                <w:color w:val="000000" w:themeColor="text1"/>
-              </w:rPr>
-              <w:t>}</w:t>
+              <w:t>${jabatan_pimpinan}</w:t>
             </w:r>
           </w:p>
           <w:p>
@@ -2947,30 +2287,8 @@
               <w:rPr>
                 <w:rFonts w:ascii="Arial" w:hAnsi="Arial" w:cs="Arial"/>
               </w:rPr>
-              <w:t xml:space="preserve">b. </w:t>
-            </w:r>
-            <w:proofErr w:type="spellStart"/>
-            <w:r>
-              <w:rPr>
-                <w:rFonts w:ascii="Arial" w:hAnsi="Arial" w:cs="Arial"/>
-              </w:rPr>
-              <w:t>Pangkat</w:t>
-            </w:r>
-            <w:proofErr w:type="spellEnd"/>
-            <w:r>
-              <w:rPr>
-                <w:rFonts w:ascii="Arial" w:hAnsi="Arial" w:cs="Arial"/>
-              </w:rPr>
-              <w:t xml:space="preserve"> dan </w:t>
-            </w:r>
-            <w:proofErr w:type="spellStart"/>
-            <w:r>
-              <w:rPr>
-                <w:rFonts w:ascii="Arial" w:hAnsi="Arial" w:cs="Arial"/>
-              </w:rPr>
-              <w:t>Golongan</w:t>
-            </w:r>
-            <w:proofErr w:type="spellEnd"/>
+              <w:t>b. Pangkat dan Golongan</w:t>
+            </w:r>
             <w:r>
               <w:rPr>
                 <w:rFonts w:ascii="Arial" w:hAnsi="Arial" w:cs="Arial"/>
@@ -2988,14 +2306,7 @@
               <w:rPr>
                 <w:rFonts w:ascii="Arial" w:hAnsi="Arial" w:cs="Arial"/>
               </w:rPr>
-              <w:t>${</w:t>
-            </w:r>
-            <w:proofErr w:type="spellStart"/>
-            <w:r>
-              <w:rPr>
-                <w:rFonts w:ascii="Arial" w:hAnsi="Arial" w:cs="Arial"/>
-              </w:rPr>
-              <w:t>golongan</w:t>
+              <w:t>${golongan</w:t>
             </w:r>
             <w:r>
               <w:rPr>
@@ -3003,7 +2314,6 @@
               </w:rPr>
               <w:t>_pimpinan</w:t>
             </w:r>
-            <w:proofErr w:type="spellEnd"/>
             <w:r>
               <w:rPr>
                 <w:rFonts w:ascii="Arial" w:hAnsi="Arial" w:cs="Arial"/>
@@ -3040,42 +2350,12 @@
                 <w:rFonts w:ascii="Arial" w:hAnsi="Arial" w:cs="Arial"/>
               </w:rPr>
             </w:pPr>
-            <w:proofErr w:type="spellStart"/>
-            <w:r>
-              <w:rPr>
-                <w:rFonts w:ascii="Arial" w:hAnsi="Arial" w:cs="Arial"/>
-              </w:rPr>
-              <w:t>Perjalanan</w:t>
-            </w:r>
-            <w:proofErr w:type="spellEnd"/>
-            <w:r>
-              <w:rPr>
-                <w:rFonts w:ascii="Arial" w:hAnsi="Arial" w:cs="Arial"/>
-              </w:rPr>
-              <w:t xml:space="preserve"> </w:t>
-            </w:r>
-            <w:proofErr w:type="spellStart"/>
-            <w:r>
-              <w:rPr>
-                <w:rFonts w:ascii="Arial" w:hAnsi="Arial" w:cs="Arial"/>
-              </w:rPr>
-              <w:t>Dinas</w:t>
-            </w:r>
-            <w:proofErr w:type="spellEnd"/>
-            <w:r>
-              <w:rPr>
-                <w:rFonts w:ascii="Arial" w:hAnsi="Arial" w:cs="Arial"/>
-              </w:rPr>
-              <w:t xml:space="preserve"> yang </w:t>
-            </w:r>
-            <w:proofErr w:type="spellStart"/>
-            <w:r>
-              <w:rPr>
-                <w:rFonts w:ascii="Arial" w:hAnsi="Arial" w:cs="Arial"/>
-              </w:rPr>
-              <w:t>diperintahkan</w:t>
-            </w:r>
-            <w:proofErr w:type="spellEnd"/>
+            <w:r>
+              <w:rPr>
+                <w:rFonts w:ascii="Arial" w:hAnsi="Arial" w:cs="Arial"/>
+              </w:rPr>
+              <w:t>Perjalanan Dinas yang diperintahkan</w:t>
+            </w:r>
             <w:r>
               <w:rPr>
                 <w:rFonts w:ascii="Arial" w:hAnsi="Arial" w:cs="Arial"/>
@@ -3101,21 +2381,7 @@
               <w:rPr>
                 <w:rFonts w:ascii="Arial" w:hAnsi="Arial" w:cs="Arial"/>
               </w:rPr>
-              <w:t>${</w:t>
-            </w:r>
-            <w:proofErr w:type="spellStart"/>
-            <w:r>
-              <w:rPr>
-                <w:rFonts w:ascii="Arial" w:hAnsi="Arial" w:cs="Arial"/>
-              </w:rPr>
-              <w:t>place_to</w:t>
-            </w:r>
-            <w:proofErr w:type="spellEnd"/>
-            <w:r>
-              <w:rPr>
-                <w:rFonts w:ascii="Arial" w:hAnsi="Arial" w:cs="Arial"/>
-              </w:rPr>
-              <w:t>}</w:t>
+              <w:t>${place_to}</w:t>
             </w:r>
           </w:p>
           <w:p>
@@ -3144,15 +2410,8 @@
                 <w:rFonts w:ascii="Arial" w:hAnsi="Arial" w:cs="Arial"/>
               </w:rPr>
               <w:tab/>
-            </w:r>
-            <w:proofErr w:type="spellStart"/>
-            <w:r>
-              <w:rPr>
-                <w:rFonts w:ascii="Arial" w:hAnsi="Arial" w:cs="Arial"/>
-              </w:rPr>
               <w:t>Ke</w:t>
             </w:r>
-            <w:proofErr w:type="spellEnd"/>
             <w:r>
               <w:rPr>
                 <w:rFonts w:ascii="Arial" w:hAnsi="Arial" w:cs="Arial"/>
@@ -3170,21 +2429,7 @@
               <w:rPr>
                 <w:rFonts w:ascii="Arial" w:hAnsi="Arial" w:cs="Arial"/>
               </w:rPr>
-              <w:t>${</w:t>
-            </w:r>
-            <w:proofErr w:type="spellStart"/>
-            <w:r>
-              <w:rPr>
-                <w:rFonts w:ascii="Arial" w:hAnsi="Arial" w:cs="Arial"/>
-              </w:rPr>
-              <w:t>place_to</w:t>
-            </w:r>
-            <w:proofErr w:type="spellEnd"/>
-            <w:r>
-              <w:rPr>
-                <w:rFonts w:ascii="Arial" w:hAnsi="Arial" w:cs="Arial"/>
-              </w:rPr>
-              <w:t>}</w:t>
+              <w:t>${place_to}</w:t>
             </w:r>
           </w:p>
           <w:p>
@@ -3213,29 +2458,8 @@
                 <w:rFonts w:ascii="Arial" w:hAnsi="Arial" w:cs="Arial"/>
               </w:rPr>
               <w:tab/>
-            </w:r>
-            <w:proofErr w:type="spellStart"/>
-            <w:r>
-              <w:rPr>
-                <w:rFonts w:ascii="Arial" w:hAnsi="Arial" w:cs="Arial"/>
-              </w:rPr>
-              <w:t>Transportasi</w:t>
-            </w:r>
-            <w:proofErr w:type="spellEnd"/>
-            <w:r>
-              <w:rPr>
-                <w:rFonts w:ascii="Arial" w:hAnsi="Arial" w:cs="Arial"/>
-              </w:rPr>
-              <w:t xml:space="preserve"> </w:t>
-            </w:r>
-            <w:proofErr w:type="spellStart"/>
-            <w:r>
-              <w:rPr>
-                <w:rFonts w:ascii="Arial" w:hAnsi="Arial" w:cs="Arial"/>
-              </w:rPr>
-              <w:t>Menggunakan</w:t>
-            </w:r>
-            <w:proofErr w:type="spellEnd"/>
+              <w:t>Transportasi Menggunakan</w:t>
+            </w:r>
             <w:r>
               <w:rPr>
                 <w:rFonts w:ascii="Arial" w:hAnsi="Arial" w:cs="Arial"/>
@@ -3281,42 +2505,12 @@
                 <w:rFonts w:ascii="Arial" w:hAnsi="Arial" w:cs="Arial"/>
               </w:rPr>
             </w:pPr>
-            <w:proofErr w:type="spellStart"/>
-            <w:r>
-              <w:rPr>
-                <w:rFonts w:ascii="Arial" w:hAnsi="Arial" w:cs="Arial"/>
-              </w:rPr>
-              <w:t>Perjalanan</w:t>
-            </w:r>
-            <w:proofErr w:type="spellEnd"/>
-            <w:r>
-              <w:rPr>
-                <w:rFonts w:ascii="Arial" w:hAnsi="Arial" w:cs="Arial"/>
-              </w:rPr>
-              <w:t xml:space="preserve"> </w:t>
-            </w:r>
-            <w:proofErr w:type="spellStart"/>
-            <w:r>
-              <w:rPr>
-                <w:rFonts w:ascii="Arial" w:hAnsi="Arial" w:cs="Arial"/>
-              </w:rPr>
-              <w:t>Dinas</w:t>
-            </w:r>
-            <w:proofErr w:type="spellEnd"/>
-            <w:r>
-              <w:rPr>
-                <w:rFonts w:ascii="Arial" w:hAnsi="Arial" w:cs="Arial"/>
-              </w:rPr>
-              <w:t xml:space="preserve"> </w:t>
-            </w:r>
-            <w:proofErr w:type="spellStart"/>
-            <w:r>
-              <w:rPr>
-                <w:rFonts w:ascii="Arial" w:hAnsi="Arial" w:cs="Arial"/>
-              </w:rPr>
-              <w:t>direncanakan</w:t>
-            </w:r>
-            <w:proofErr w:type="spellEnd"/>
+            <w:r>
+              <w:rPr>
+                <w:rFonts w:ascii="Arial" w:hAnsi="Arial" w:cs="Arial"/>
+              </w:rPr>
+              <w:t>Perjalanan Dinas direncanakan</w:t>
+            </w:r>
             <w:r>
               <w:rPr>
                 <w:rFonts w:ascii="Arial" w:hAnsi="Arial" w:cs="Arial"/>
@@ -3329,15 +2523,8 @@
                 <w:rFonts w:ascii="Arial" w:hAnsi="Arial" w:cs="Arial"/>
               </w:rPr>
               <w:tab/>
-            </w:r>
-            <w:proofErr w:type="spellStart"/>
-            <w:r>
-              <w:rPr>
-                <w:rFonts w:ascii="Arial" w:hAnsi="Arial" w:cs="Arial"/>
-              </w:rPr>
               <w:t>Selama</w:t>
             </w:r>
-            <w:proofErr w:type="spellEnd"/>
             <w:r>
               <w:rPr>
                 <w:rFonts w:ascii="Arial" w:hAnsi="Arial" w:cs="Arial"/>
@@ -3357,14 +2544,12 @@
               </w:rPr>
               <w:t>${</w:t>
             </w:r>
-            <w:proofErr w:type="spellStart"/>
             <w:r>
               <w:rPr>
                 <w:rFonts w:ascii="Arial" w:hAnsi="Arial" w:cs="Arial"/>
               </w:rPr>
               <w:t>length_journey</w:t>
             </w:r>
-            <w:proofErr w:type="spellEnd"/>
             <w:r>
               <w:rPr>
                 <w:rFonts w:ascii="Arial" w:hAnsi="Arial" w:cs="Arial"/>
@@ -3400,16 +2585,8 @@
                 <w:rFonts w:ascii="Arial" w:hAnsi="Arial" w:cs="Arial"/>
               </w:rPr>
               <w:tab/>
-              <w:t xml:space="preserve">Dari </w:t>
-            </w:r>
-            <w:proofErr w:type="spellStart"/>
-            <w:r>
-              <w:rPr>
-                <w:rFonts w:ascii="Arial" w:hAnsi="Arial" w:cs="Arial"/>
-              </w:rPr>
-              <w:t>Tanggal</w:t>
-            </w:r>
-            <w:proofErr w:type="spellEnd"/>
+              <w:t>Dari Tanggal</w:t>
+            </w:r>
             <w:r>
               <w:rPr>
                 <w:rFonts w:ascii="Arial" w:hAnsi="Arial" w:cs="Arial"/>
@@ -3427,21 +2604,7 @@
               <w:rPr>
                 <w:rFonts w:ascii="Arial" w:hAnsi="Arial" w:cs="Arial"/>
               </w:rPr>
-              <w:t>${</w:t>
-            </w:r>
-            <w:proofErr w:type="spellStart"/>
-            <w:r>
-              <w:rPr>
-                <w:rFonts w:ascii="Arial" w:hAnsi="Arial" w:cs="Arial"/>
-              </w:rPr>
-              <w:t>date_go</w:t>
-            </w:r>
-            <w:proofErr w:type="spellEnd"/>
-            <w:r>
-              <w:rPr>
-                <w:rFonts w:ascii="Arial" w:hAnsi="Arial" w:cs="Arial"/>
-              </w:rPr>
-              <w:t>}</w:t>
+              <w:t>${date_go}</w:t>
             </w:r>
             <w:r>
               <w:rPr>
@@ -3477,56 +2640,12 @@
                 <w:rFonts w:ascii="Arial" w:hAnsi="Arial" w:cs="Arial"/>
               </w:rPr>
             </w:pPr>
-            <w:proofErr w:type="spellStart"/>
-            <w:r>
-              <w:rPr>
-                <w:rFonts w:ascii="Arial" w:hAnsi="Arial" w:cs="Arial"/>
-              </w:rPr>
-              <w:t>Maksud</w:t>
-            </w:r>
-            <w:proofErr w:type="spellEnd"/>
-            <w:r>
-              <w:rPr>
-                <w:rFonts w:ascii="Arial" w:hAnsi="Arial" w:cs="Arial"/>
-              </w:rPr>
-              <w:t xml:space="preserve"> </w:t>
-            </w:r>
-            <w:proofErr w:type="spellStart"/>
-            <w:r>
-              <w:rPr>
-                <w:rFonts w:ascii="Arial" w:hAnsi="Arial" w:cs="Arial"/>
-              </w:rPr>
-              <w:t>mengadakan</w:t>
-            </w:r>
-            <w:proofErr w:type="spellEnd"/>
-            <w:r>
-              <w:rPr>
-                <w:rFonts w:ascii="Arial" w:hAnsi="Arial" w:cs="Arial"/>
-              </w:rPr>
-              <w:t xml:space="preserve"> </w:t>
-            </w:r>
-            <w:proofErr w:type="spellStart"/>
-            <w:r>
-              <w:rPr>
-                <w:rFonts w:ascii="Arial" w:hAnsi="Arial" w:cs="Arial"/>
-              </w:rPr>
-              <w:t>Perjalanan</w:t>
-            </w:r>
-            <w:proofErr w:type="spellEnd"/>
-            <w:r>
-              <w:rPr>
-                <w:rFonts w:ascii="Arial" w:hAnsi="Arial" w:cs="Arial"/>
-              </w:rPr>
-              <w:t xml:space="preserve"> </w:t>
-            </w:r>
-            <w:proofErr w:type="spellStart"/>
-            <w:r>
-              <w:rPr>
-                <w:rFonts w:ascii="Arial" w:hAnsi="Arial" w:cs="Arial"/>
-              </w:rPr>
-              <w:t>Dinas</w:t>
-            </w:r>
-            <w:proofErr w:type="spellEnd"/>
+            <w:r>
+              <w:rPr>
+                <w:rFonts w:ascii="Arial" w:hAnsi="Arial" w:cs="Arial"/>
+              </w:rPr>
+              <w:t>Maksud mengadakan Perjalanan Dinas</w:t>
+            </w:r>
             <w:r>
               <w:rPr>
                 <w:rFonts w:ascii="Arial" w:hAnsi="Arial" w:cs="Arial"/>
@@ -3589,42 +2708,12 @@
                 <w:rFonts w:ascii="Arial" w:hAnsi="Arial" w:cs="Arial"/>
               </w:rPr>
             </w:pPr>
-            <w:proofErr w:type="spellStart"/>
-            <w:r>
-              <w:rPr>
-                <w:rFonts w:ascii="Arial" w:hAnsi="Arial" w:cs="Arial"/>
-              </w:rPr>
-              <w:t>Perhitungan</w:t>
-            </w:r>
-            <w:proofErr w:type="spellEnd"/>
-            <w:r>
-              <w:rPr>
-                <w:rFonts w:ascii="Arial" w:hAnsi="Arial" w:cs="Arial"/>
-              </w:rPr>
-              <w:t xml:space="preserve"> </w:t>
-            </w:r>
-            <w:proofErr w:type="spellStart"/>
-            <w:r>
-              <w:rPr>
-                <w:rFonts w:ascii="Arial" w:hAnsi="Arial" w:cs="Arial"/>
-              </w:rPr>
-              <w:t>Biaya</w:t>
-            </w:r>
-            <w:proofErr w:type="spellEnd"/>
-            <w:r>
-              <w:rPr>
-                <w:rFonts w:ascii="Arial" w:hAnsi="Arial" w:cs="Arial"/>
-              </w:rPr>
-              <w:t xml:space="preserve"> </w:t>
-            </w:r>
-            <w:proofErr w:type="spellStart"/>
-            <w:r>
-              <w:rPr>
-                <w:rFonts w:ascii="Arial" w:hAnsi="Arial" w:cs="Arial"/>
-              </w:rPr>
-              <w:t>Perjalanan</w:t>
-            </w:r>
-            <w:proofErr w:type="spellEnd"/>
+            <w:r>
+              <w:rPr>
+                <w:rFonts w:ascii="Arial" w:hAnsi="Arial" w:cs="Arial"/>
+              </w:rPr>
+              <w:t>Perhitungan Biaya Perjalanan</w:t>
+            </w:r>
             <w:r>
               <w:rPr>
                 <w:rFonts w:ascii="Arial" w:hAnsi="Arial" w:cs="Arial"/>
@@ -3637,16 +2726,8 @@
                 <w:rFonts w:ascii="Arial" w:hAnsi="Arial" w:cs="Arial"/>
               </w:rPr>
               <w:tab/>
-              <w:t xml:space="preserve">Atas </w:t>
-            </w:r>
-            <w:proofErr w:type="spellStart"/>
-            <w:r>
-              <w:rPr>
-                <w:rFonts w:ascii="Arial" w:hAnsi="Arial" w:cs="Arial"/>
-              </w:rPr>
-              <w:t>beban</w:t>
-            </w:r>
-            <w:proofErr w:type="spellEnd"/>
+              <w:t>Atas beban</w:t>
+            </w:r>
             <w:r>
               <w:rPr>
                 <w:rFonts w:ascii="Arial" w:hAnsi="Arial" w:cs="Arial"/>
@@ -3692,16 +2773,8 @@
                 <w:rFonts w:ascii="Arial" w:hAnsi="Arial" w:cs="Arial"/>
               </w:rPr>
               <w:tab/>
-              <w:t xml:space="preserve">No. </w:t>
-            </w:r>
-            <w:proofErr w:type="spellStart"/>
-            <w:r>
-              <w:rPr>
-                <w:rFonts w:ascii="Arial" w:hAnsi="Arial" w:cs="Arial"/>
-              </w:rPr>
-              <w:t>Rekening</w:t>
-            </w:r>
-            <w:proofErr w:type="spellEnd"/>
+              <w:t>No. Rekening</w:t>
+            </w:r>
             <w:r>
               <w:rPr>
                 <w:rFonts w:ascii="Arial" w:hAnsi="Arial" w:cs="Arial"/>
@@ -3713,21 +2786,7 @@
               <w:rPr>
                 <w:rFonts w:ascii="Arial" w:hAnsi="Arial" w:cs="Arial"/>
               </w:rPr>
-              <w:t>${</w:t>
-            </w:r>
-            <w:proofErr w:type="spellStart"/>
-            <w:r>
-              <w:rPr>
-                <w:rFonts w:ascii="Arial" w:hAnsi="Arial" w:cs="Arial"/>
-              </w:rPr>
-              <w:t>budget_from</w:t>
-            </w:r>
-            <w:proofErr w:type="spellEnd"/>
-            <w:r>
-              <w:rPr>
-                <w:rFonts w:ascii="Arial" w:hAnsi="Arial" w:cs="Arial"/>
-              </w:rPr>
-              <w:t>}</w:t>
+              <w:t>${budget_from}</w:t>
             </w:r>
           </w:p>
         </w:tc>
@@ -3820,21 +2879,12 @@
           <w:lang w:eastAsia="ko-KR"/>
         </w:rPr>
       </w:pPr>
-      <w:proofErr w:type="spellStart"/>
-      <w:r>
-        <w:rPr>
-          <w:rFonts w:ascii="Arial" w:hAnsi="Arial" w:cs="Arial"/>
-          <w:lang w:eastAsia="ko-KR"/>
-        </w:rPr>
-        <w:t>Dikeluarkan</w:t>
-      </w:r>
-      <w:proofErr w:type="spellEnd"/>
-      <w:r>
-        <w:rPr>
-          <w:rFonts w:ascii="Arial" w:hAnsi="Arial" w:cs="Arial"/>
-          <w:lang w:eastAsia="ko-KR"/>
-        </w:rPr>
-        <w:t xml:space="preserve"> di </w:t>
+      <w:r>
+        <w:rPr>
+          <w:rFonts w:ascii="Arial" w:hAnsi="Arial" w:cs="Arial"/>
+          <w:lang w:eastAsia="ko-KR"/>
+        </w:rPr>
+        <w:t xml:space="preserve">Dikeluarkan di </w:t>
       </w:r>
       <w:r>
         <w:rPr>
@@ -3844,15 +2894,7 @@
         <w:t xml:space="preserve"> </w:t>
       </w:r>
       <w:r>
-        <w:t>${</w:t>
-      </w:r>
-      <w:proofErr w:type="spellStart"/>
-      <w:r>
-        <w:t>daerah</w:t>
-      </w:r>
-      <w:proofErr w:type="spellEnd"/>
-      <w:r>
-        <w:t>}</w:t>
+        <w:t>${daerah}</w:t>
       </w:r>
     </w:p>
     <w:p>
@@ -3868,34 +2910,10 @@
           <w:rFonts w:ascii="Arial" w:hAnsi="Arial" w:cs="Arial"/>
           <w:lang w:eastAsia="ko-KR"/>
         </w:rPr>
-        <w:t xml:space="preserve">Pada </w:t>
-      </w:r>
-      <w:proofErr w:type="spellStart"/>
-      <w:r>
-        <w:rPr>
-          <w:rFonts w:ascii="Arial" w:hAnsi="Arial" w:cs="Arial"/>
-          <w:lang w:eastAsia="ko-KR"/>
-        </w:rPr>
-        <w:t>tanggal</w:t>
-      </w:r>
-      <w:proofErr w:type="spellEnd"/>
-      <w:r>
-        <w:rPr>
-          <w:rFonts w:ascii="Arial" w:hAnsi="Arial" w:cs="Arial"/>
-          <w:lang w:eastAsia="ko-KR"/>
-        </w:rPr>
-        <w:t xml:space="preserve"> </w:t>
-      </w:r>
-      <w:r>
-        <w:t>${</w:t>
-      </w:r>
-      <w:proofErr w:type="spellStart"/>
-      <w:r>
-        <w:t>tanggal</w:t>
-      </w:r>
-      <w:proofErr w:type="spellEnd"/>
-      <w:r>
-        <w:t>}</w:t>
+        <w:t xml:space="preserve">Pada tanggal </w:t>
+      </w:r>
+      <w:r>
+        <w:t>${tanggal}</w:t>
       </w:r>
       <w:r>
         <w:t xml:space="preserve"> </w:t>
@@ -3957,15 +2975,7 @@
           <w:rFonts w:ascii="Arial" w:hAnsi="Arial" w:cs="Arial"/>
           <w:lang w:eastAsia="ko-KR"/>
         </w:rPr>
-        <w:t>[</w:t>
-      </w:r>
-      <w:proofErr w:type="spellStart"/>
-      <w:r>
-        <w:rPr>
-          <w:rFonts w:ascii="Arial" w:hAnsi="Arial" w:cs="Arial"/>
-          <w:lang w:eastAsia="ko-KR"/>
-        </w:rPr>
-        <w:t>nama</w:t>
+        <w:t>[nama</w:t>
       </w:r>
       <w:r>
         <w:rPr>
@@ -3973,7 +2983,6 @@
         </w:rPr>
         <w:t>_pemberi_tugas</w:t>
       </w:r>
-      <w:proofErr w:type="spellEnd"/>
       <w:r>
         <w:rPr>
           <w:rFonts w:ascii="Arial" w:hAnsi="Arial" w:cs="Arial"/>
@@ -4001,15 +3010,7 @@
           <w:rFonts w:ascii="Arial" w:hAnsi="Arial" w:cs="Arial"/>
           <w:lang w:eastAsia="ko-KR"/>
         </w:rPr>
-        <w:t>[</w:t>
-      </w:r>
-      <w:proofErr w:type="spellStart"/>
-      <w:r>
-        <w:rPr>
-          <w:rFonts w:ascii="Arial" w:hAnsi="Arial" w:cs="Arial"/>
-          <w:lang w:eastAsia="ko-KR"/>
-        </w:rPr>
-        <w:t>pangkat</w:t>
+        <w:t>[pangkat</w:t>
       </w:r>
       <w:r>
         <w:rPr>
@@ -4017,7 +3018,6 @@
         </w:rPr>
         <w:t>_pemberi_tugas</w:t>
       </w:r>
-      <w:proofErr w:type="spellEnd"/>
       <w:r>
         <w:rPr>
           <w:rFonts w:ascii="Arial" w:hAnsi="Arial" w:cs="Arial"/>
@@ -4045,23 +3045,7 @@
           <w:rFonts w:ascii="Arial" w:hAnsi="Arial" w:cs="Arial"/>
           <w:lang w:eastAsia="ko-KR"/>
         </w:rPr>
-        <w:t>NIP. [</w:t>
-      </w:r>
-      <w:proofErr w:type="spellStart"/>
-      <w:r>
-        <w:rPr>
-          <w:rFonts w:ascii="Arial" w:hAnsi="Arial" w:cs="Arial"/>
-          <w:lang w:eastAsia="ko-KR"/>
-        </w:rPr>
-        <w:t>no_nip</w:t>
-      </w:r>
-      <w:proofErr w:type="spellEnd"/>
-      <w:r>
-        <w:rPr>
-          <w:rFonts w:ascii="Arial" w:hAnsi="Arial" w:cs="Arial"/>
-          <w:lang w:eastAsia="ko-KR"/>
-        </w:rPr>
-        <w:t>]</w:t>
+        <w:t>NIP. [no_nip]</w:t>
       </w:r>
     </w:p>
     <w:p>
@@ -4085,23 +3069,7 @@
           <w:rFonts w:ascii="Arial" w:hAnsi="Arial" w:cs="Arial"/>
           <w:lang w:eastAsia="ko-KR"/>
         </w:rPr>
-        <w:t>SP. [</w:t>
-      </w:r>
-      <w:proofErr w:type="spellStart"/>
-      <w:r>
-        <w:rPr>
-          <w:rFonts w:ascii="Arial" w:hAnsi="Arial" w:cs="Arial"/>
-          <w:lang w:eastAsia="ko-KR"/>
-        </w:rPr>
-        <w:t>no_sp</w:t>
-      </w:r>
-      <w:proofErr w:type="spellEnd"/>
-      <w:r>
-        <w:rPr>
-          <w:rFonts w:ascii="Arial" w:hAnsi="Arial" w:cs="Arial"/>
-          <w:lang w:eastAsia="ko-KR"/>
-        </w:rPr>
-        <w:t xml:space="preserve">] </w:t>
+        <w:t xml:space="preserve">SP. [no_sp] </w:t>
       </w:r>
       <w:r>
         <w:rPr>
@@ -4111,95 +3079,7 @@
           <w:szCs w:val="20"/>
           <w:lang w:eastAsia="ko-KR"/>
         </w:rPr>
-        <w:t xml:space="preserve">(SP. </w:t>
-      </w:r>
-      <w:proofErr w:type="spellStart"/>
-      <w:r>
-        <w:rPr>
-          <w:rFonts w:ascii="Arial" w:hAnsi="Arial" w:cs="Arial"/>
-          <w:color w:val="FF0000"/>
-          <w:sz w:val="20"/>
-          <w:szCs w:val="20"/>
-          <w:lang w:eastAsia="ko-KR"/>
-        </w:rPr>
-        <w:t>akan</w:t>
-      </w:r>
-      <w:proofErr w:type="spellEnd"/>
-      <w:r>
-        <w:rPr>
-          <w:rFonts w:ascii="Arial" w:hAnsi="Arial" w:cs="Arial"/>
-          <w:color w:val="FF0000"/>
-          <w:sz w:val="20"/>
-          <w:szCs w:val="20"/>
-          <w:lang w:eastAsia="ko-KR"/>
-        </w:rPr>
-        <w:t xml:space="preserve"> </w:t>
-      </w:r>
-      <w:proofErr w:type="spellStart"/>
-      <w:r>
-        <w:rPr>
-          <w:rFonts w:ascii="Arial" w:hAnsi="Arial" w:cs="Arial"/>
-          <w:color w:val="FF0000"/>
-          <w:sz w:val="20"/>
-          <w:szCs w:val="20"/>
-          <w:lang w:eastAsia="ko-KR"/>
-        </w:rPr>
-        <w:t>muncul</w:t>
-      </w:r>
-      <w:proofErr w:type="spellEnd"/>
-      <w:r>
-        <w:rPr>
-          <w:rFonts w:ascii="Arial" w:hAnsi="Arial" w:cs="Arial"/>
-          <w:color w:val="FF0000"/>
-          <w:sz w:val="20"/>
-          <w:szCs w:val="20"/>
-          <w:lang w:eastAsia="ko-KR"/>
-        </w:rPr>
-        <w:t xml:space="preserve"> </w:t>
-      </w:r>
-      <w:proofErr w:type="spellStart"/>
-      <w:r>
-        <w:rPr>
-          <w:rFonts w:ascii="Arial" w:hAnsi="Arial" w:cs="Arial"/>
-          <w:color w:val="FF0000"/>
-          <w:sz w:val="20"/>
-          <w:szCs w:val="20"/>
-          <w:lang w:eastAsia="ko-KR"/>
-        </w:rPr>
-        <w:t>jika</w:t>
-      </w:r>
-      <w:proofErr w:type="spellEnd"/>
-      <w:r>
-        <w:rPr>
-          <w:rFonts w:ascii="Arial" w:hAnsi="Arial" w:cs="Arial"/>
-          <w:color w:val="FF0000"/>
-          <w:sz w:val="20"/>
-          <w:szCs w:val="20"/>
-          <w:lang w:eastAsia="ko-KR"/>
-        </w:rPr>
-        <w:t xml:space="preserve"> </w:t>
-      </w:r>
-      <w:proofErr w:type="spellStart"/>
-      <w:r>
-        <w:rPr>
-          <w:rFonts w:ascii="Arial" w:hAnsi="Arial" w:cs="Arial"/>
-          <w:color w:val="FF0000"/>
-          <w:sz w:val="20"/>
-          <w:szCs w:val="20"/>
-          <w:lang w:eastAsia="ko-KR"/>
-        </w:rPr>
-        <w:t>diperlukan</w:t>
-      </w:r>
-      <w:proofErr w:type="spellEnd"/>
-      <w:r>
-        <w:rPr>
-          <w:rFonts w:ascii="Arial" w:hAnsi="Arial" w:cs="Arial"/>
-          <w:color w:val="FF0000"/>
-          <w:sz w:val="20"/>
-          <w:szCs w:val="20"/>
-          <w:lang w:eastAsia="ko-KR"/>
-        </w:rPr>
-        <w:t>)</w:t>
+        <w:t>(SP. akan muncul jika diperlukan)</w:t>
       </w:r>
     </w:p>
     <w:p>
@@ -4390,70 +3270,12 @@
           <w:rFonts w:ascii="Arial" w:hAnsi="Arial" w:cs="Arial"/>
         </w:rPr>
       </w:pPr>
-      <w:proofErr w:type="spellStart"/>
-      <w:r>
-        <w:rPr>
-          <w:rFonts w:ascii="Arial" w:hAnsi="Arial" w:cs="Arial"/>
-        </w:rPr>
-        <w:t>Tempat</w:t>
-      </w:r>
-      <w:proofErr w:type="spellEnd"/>
-      <w:r>
-        <w:rPr>
-          <w:rFonts w:ascii="Arial" w:hAnsi="Arial" w:cs="Arial"/>
-        </w:rPr>
-        <w:t xml:space="preserve"> </w:t>
-      </w:r>
-      <w:proofErr w:type="spellStart"/>
-      <w:r>
-        <w:rPr>
-          <w:rFonts w:ascii="Arial" w:hAnsi="Arial" w:cs="Arial"/>
-        </w:rPr>
-        <w:t>Kedudukan</w:t>
-      </w:r>
-      <w:proofErr w:type="spellEnd"/>
-      <w:r>
-        <w:rPr>
-          <w:rFonts w:ascii="Arial" w:hAnsi="Arial" w:cs="Arial"/>
-        </w:rPr>
-        <w:t xml:space="preserve"> </w:t>
-      </w:r>
-      <w:proofErr w:type="spellStart"/>
-      <w:r>
-        <w:rPr>
-          <w:rFonts w:ascii="Arial" w:hAnsi="Arial" w:cs="Arial"/>
-        </w:rPr>
-        <w:t>Pegawai</w:t>
-      </w:r>
-      <w:proofErr w:type="spellEnd"/>
-      <w:r>
-        <w:rPr>
-          <w:rFonts w:ascii="Arial" w:hAnsi="Arial" w:cs="Arial"/>
-        </w:rPr>
-        <w:t xml:space="preserve"> yang </w:t>
-      </w:r>
-      <w:proofErr w:type="spellStart"/>
-      <w:r>
-        <w:rPr>
-          <w:rFonts w:ascii="Arial" w:hAnsi="Arial" w:cs="Arial"/>
-        </w:rPr>
-        <w:t>diberi</w:t>
-      </w:r>
-      <w:proofErr w:type="spellEnd"/>
-      <w:r>
-        <w:rPr>
-          <w:rFonts w:ascii="Arial" w:hAnsi="Arial" w:cs="Arial"/>
-        </w:rPr>
-        <w:t xml:space="preserve"> </w:t>
-      </w:r>
-      <w:proofErr w:type="spellStart"/>
-      <w:r>
-        <w:rPr>
-          <w:rFonts w:ascii="Arial" w:hAnsi="Arial" w:cs="Arial"/>
-        </w:rPr>
-        <w:t>Perintah</w:t>
-      </w:r>
-      <w:proofErr w:type="spellEnd"/>
+      <w:r>
+        <w:rPr>
+          <w:rFonts w:ascii="Arial" w:hAnsi="Arial" w:cs="Arial"/>
+        </w:rPr>
+        <w:t>Tempat Kedudukan Pegawai yang diberi Perintah</w:t>
+      </w:r>
     </w:p>
     <w:p>
       <w:pPr>
@@ -4479,28 +3301,12 @@
           <w:rFonts w:ascii="Arial" w:hAnsi="Arial" w:cs="Arial"/>
         </w:rPr>
       </w:pPr>
-      <w:proofErr w:type="spellStart"/>
-      <w:r>
-        <w:rPr>
-          <w:rFonts w:ascii="Arial" w:hAnsi="Arial" w:cs="Arial"/>
-        </w:rPr>
-        <w:t>Berangkat</w:t>
-      </w:r>
-      <w:proofErr w:type="spellEnd"/>
-      <w:r>
-        <w:rPr>
-          <w:rFonts w:ascii="Arial" w:hAnsi="Arial" w:cs="Arial"/>
-        </w:rPr>
-        <w:t xml:space="preserve"> </w:t>
-      </w:r>
-      <w:proofErr w:type="spellStart"/>
-      <w:r>
-        <w:rPr>
-          <w:rFonts w:ascii="Arial" w:hAnsi="Arial" w:cs="Arial"/>
-        </w:rPr>
-        <w:t>dari</w:t>
-      </w:r>
-      <w:proofErr w:type="spellEnd"/>
+      <w:r>
+        <w:rPr>
+          <w:rFonts w:ascii="Arial" w:hAnsi="Arial" w:cs="Arial"/>
+        </w:rPr>
+        <w:t>Berangkat dari</w:t>
+      </w:r>
       <w:r>
         <w:rPr>
           <w:rFonts w:ascii="Arial" w:hAnsi="Arial" w:cs="Arial"/>
@@ -4518,21 +3324,7 @@
         <w:rPr>
           <w:rFonts w:ascii="Arial" w:hAnsi="Arial" w:cs="Arial"/>
         </w:rPr>
-        <w:t>${</w:t>
-      </w:r>
-      <w:proofErr w:type="spellStart"/>
-      <w:r>
-        <w:rPr>
-          <w:rFonts w:ascii="Arial" w:hAnsi="Arial" w:cs="Arial"/>
-        </w:rPr>
-        <w:t>place_from</w:t>
-      </w:r>
-      <w:proofErr w:type="spellEnd"/>
-      <w:r>
-        <w:rPr>
-          <w:rFonts w:ascii="Arial" w:hAnsi="Arial" w:cs="Arial"/>
-        </w:rPr>
-        <w:t>}</w:t>
+        <w:t>${place_from}</w:t>
       </w:r>
       <w:r>
         <w:rPr>
@@ -4558,21 +3350,7 @@
         <w:rPr>
           <w:rFonts w:ascii="Arial" w:hAnsi="Arial" w:cs="Arial"/>
         </w:rPr>
-        <w:t>${</w:t>
-      </w:r>
-      <w:proofErr w:type="spellStart"/>
-      <w:r>
-        <w:rPr>
-          <w:rFonts w:ascii="Arial" w:hAnsi="Arial" w:cs="Arial"/>
-        </w:rPr>
-        <w:t>place_from</w:t>
-      </w:r>
-      <w:proofErr w:type="spellEnd"/>
-      <w:r>
-        <w:rPr>
-          <w:rFonts w:ascii="Arial" w:hAnsi="Arial" w:cs="Arial"/>
-        </w:rPr>
-        <w:t>}</w:t>
+        <w:t>${place_from}</w:t>
       </w:r>
     </w:p>
     <w:p>
@@ -4590,14 +3368,12 @@
           <w:rFonts w:ascii="Arial" w:hAnsi="Arial" w:cs="Arial"/>
         </w:rPr>
       </w:pPr>
-      <w:proofErr w:type="spellStart"/>
       <w:r>
         <w:rPr>
           <w:rFonts w:ascii="Arial" w:hAnsi="Arial" w:cs="Arial"/>
         </w:rPr>
         <w:t>Tanggal</w:t>
       </w:r>
-      <w:proofErr w:type="spellEnd"/>
       <w:r>
         <w:rPr>
           <w:rFonts w:ascii="Arial" w:hAnsi="Arial" w:cs="Arial"/>
@@ -4622,15 +3398,8 @@
           <w:rFonts w:ascii="Arial" w:hAnsi="Arial" w:cs="Arial"/>
         </w:rPr>
         <w:tab/>
-      </w:r>
-      <w:proofErr w:type="spellStart"/>
-      <w:r>
-        <w:rPr>
-          <w:rFonts w:ascii="Arial" w:hAnsi="Arial" w:cs="Arial"/>
-        </w:rPr>
         <w:t>Tanggal</w:t>
       </w:r>
-      <w:proofErr w:type="spellEnd"/>
       <w:r>
         <w:rPr>
           <w:rFonts w:ascii="Arial" w:hAnsi="Arial" w:cs="Arial"/>
@@ -4648,21 +3417,7 @@
         <w:rPr>
           <w:rFonts w:ascii="Arial" w:hAnsi="Arial" w:cs="Arial"/>
         </w:rPr>
-        <w:t>${</w:t>
-      </w:r>
-      <w:proofErr w:type="spellStart"/>
-      <w:r>
-        <w:rPr>
-          <w:rFonts w:ascii="Arial" w:hAnsi="Arial" w:cs="Arial"/>
-        </w:rPr>
-        <w:t>date_back</w:t>
-      </w:r>
-      <w:proofErr w:type="spellEnd"/>
-      <w:r>
-        <w:rPr>
-          <w:rFonts w:ascii="Arial" w:hAnsi="Arial" w:cs="Arial"/>
-        </w:rPr>
-        <w:t>}</w:t>
+        <w:t>${date_back}</w:t>
       </w:r>
     </w:p>
     <w:p>
@@ -4747,23 +3502,7 @@
                 <w:rFonts w:ascii="Arial" w:hAnsi="Arial" w:cs="Arial"/>
                 <w:lang w:eastAsia="ko-KR"/>
               </w:rPr>
-              <w:t>[</w:t>
-            </w:r>
-            <w:proofErr w:type="spellStart"/>
-            <w:r>
-              <w:rPr>
-                <w:rFonts w:ascii="Arial" w:hAnsi="Arial" w:cs="Arial"/>
-                <w:lang w:eastAsia="ko-KR"/>
-              </w:rPr>
-              <w:t>penandatangan_sppd_belakang</w:t>
-            </w:r>
-            <w:proofErr w:type="spellEnd"/>
-            <w:r>
-              <w:rPr>
-                <w:rFonts w:ascii="Arial" w:hAnsi="Arial" w:cs="Arial"/>
-                <w:lang w:eastAsia="ko-KR"/>
-              </w:rPr>
-              <w:t>]</w:t>
+              <w:t>[penandatangan_sppd_belakang]</w:t>
             </w:r>
           </w:p>
           <w:p>
@@ -4825,45 +3564,20 @@
                 <w:rFonts w:ascii="Arial" w:hAnsi="Arial" w:cs="Arial"/>
                 <w:lang w:eastAsia="ko-KR"/>
               </w:rPr>
-              <w:t>[</w:t>
-            </w:r>
-            <w:proofErr w:type="spellStart"/>
+              <w:t>[nama</w:t>
+            </w:r>
+            <w:r>
+              <w:rPr>
+                <w:rFonts w:ascii="Arial" w:hAnsi="Arial" w:cs="Arial"/>
+              </w:rPr>
+              <w:t>_</w:t>
+            </w:r>
             <w:r>
               <w:rPr>
                 <w:rFonts w:ascii="Arial" w:hAnsi="Arial" w:cs="Arial"/>
                 <w:lang w:eastAsia="ko-KR"/>
               </w:rPr>
-              <w:t>nama</w:t>
-            </w:r>
-            <w:proofErr w:type="spellEnd"/>
-            <w:r>
-              <w:rPr>
-                <w:rFonts w:ascii="Arial" w:hAnsi="Arial" w:cs="Arial"/>
-              </w:rPr>
-              <w:t>_</w:t>
-            </w:r>
-            <w:r>
-              <w:rPr>
-                <w:rFonts w:ascii="Arial" w:hAnsi="Arial" w:cs="Arial"/>
-                <w:lang w:eastAsia="ko-KR"/>
-              </w:rPr>
-              <w:t xml:space="preserve"> </w:t>
-            </w:r>
-            <w:proofErr w:type="spellStart"/>
-            <w:r>
-              <w:rPr>
-                <w:rFonts w:ascii="Arial" w:hAnsi="Arial" w:cs="Arial"/>
-                <w:lang w:eastAsia="ko-KR"/>
-              </w:rPr>
-              <w:t>penandatangan_sppd_belakang</w:t>
-            </w:r>
-            <w:proofErr w:type="spellEnd"/>
-            <w:r>
-              <w:rPr>
-                <w:rFonts w:ascii="Arial" w:hAnsi="Arial" w:cs="Arial"/>
-                <w:lang w:eastAsia="ko-KR"/>
-              </w:rPr>
-              <w:t>]</w:t>
+              <w:t xml:space="preserve"> penandatangan_sppd_belakang]</w:t>
             </w:r>
           </w:p>
           <w:p>
@@ -4886,45 +3600,20 @@
                 <w:rFonts w:ascii="Arial" w:hAnsi="Arial" w:cs="Arial"/>
                 <w:lang w:eastAsia="ko-KR"/>
               </w:rPr>
-              <w:t>[</w:t>
-            </w:r>
-            <w:proofErr w:type="spellStart"/>
+              <w:t>[pangkat</w:t>
+            </w:r>
+            <w:r>
+              <w:rPr>
+                <w:rFonts w:ascii="Arial" w:hAnsi="Arial" w:cs="Arial"/>
+              </w:rPr>
+              <w:t>_</w:t>
+            </w:r>
             <w:r>
               <w:rPr>
                 <w:rFonts w:ascii="Arial" w:hAnsi="Arial" w:cs="Arial"/>
                 <w:lang w:eastAsia="ko-KR"/>
               </w:rPr>
-              <w:t>pangkat</w:t>
-            </w:r>
-            <w:proofErr w:type="spellEnd"/>
-            <w:r>
-              <w:rPr>
-                <w:rFonts w:ascii="Arial" w:hAnsi="Arial" w:cs="Arial"/>
-              </w:rPr>
-              <w:t>_</w:t>
-            </w:r>
-            <w:r>
-              <w:rPr>
-                <w:rFonts w:ascii="Arial" w:hAnsi="Arial" w:cs="Arial"/>
-                <w:lang w:eastAsia="ko-KR"/>
-              </w:rPr>
-              <w:t xml:space="preserve"> </w:t>
-            </w:r>
-            <w:proofErr w:type="spellStart"/>
-            <w:r>
-              <w:rPr>
-                <w:rFonts w:ascii="Arial" w:hAnsi="Arial" w:cs="Arial"/>
-                <w:lang w:eastAsia="ko-KR"/>
-              </w:rPr>
-              <w:t>penandatangan_sppd_belakang</w:t>
-            </w:r>
-            <w:proofErr w:type="spellEnd"/>
-            <w:r>
-              <w:rPr>
-                <w:rFonts w:ascii="Arial" w:hAnsi="Arial" w:cs="Arial"/>
-                <w:lang w:eastAsia="ko-KR"/>
-              </w:rPr>
-              <w:t>]</w:t>
+              <w:t xml:space="preserve"> penandatangan_sppd_belakang]</w:t>
             </w:r>
           </w:p>
           <w:p>
@@ -4947,39 +3636,7 @@
                 <w:rFonts w:ascii="Arial" w:hAnsi="Arial" w:cs="Arial"/>
                 <w:lang w:eastAsia="ko-KR"/>
               </w:rPr>
-              <w:t>NIP. [</w:t>
-            </w:r>
-            <w:proofErr w:type="spellStart"/>
-            <w:r>
-              <w:rPr>
-                <w:rFonts w:ascii="Arial" w:hAnsi="Arial" w:cs="Arial"/>
-                <w:lang w:eastAsia="ko-KR"/>
-              </w:rPr>
-              <w:t>no_nip</w:t>
-            </w:r>
-            <w:proofErr w:type="spellEnd"/>
-            <w:r>
-              <w:rPr>
-                <w:rFonts w:ascii="Arial" w:hAnsi="Arial" w:cs="Arial"/>
-                <w:lang w:eastAsia="ko-KR"/>
-              </w:rPr>
-              <w:t xml:space="preserve">_ </w:t>
-            </w:r>
-            <w:proofErr w:type="spellStart"/>
-            <w:r>
-              <w:rPr>
-                <w:rFonts w:ascii="Arial" w:hAnsi="Arial" w:cs="Arial"/>
-                <w:lang w:eastAsia="ko-KR"/>
-              </w:rPr>
-              <w:t>penandatangan_sppd_belakang</w:t>
-            </w:r>
-            <w:proofErr w:type="spellEnd"/>
-            <w:r>
-              <w:rPr>
-                <w:rFonts w:ascii="Arial" w:hAnsi="Arial" w:cs="Arial"/>
-                <w:lang w:eastAsia="ko-KR"/>
-              </w:rPr>
-              <w:t>]</w:t>
+              <w:t>NIP. [no_nip_ penandatangan_sppd_belakang]</w:t>
             </w:r>
           </w:p>
           <w:p>
@@ -5019,23 +3676,7 @@
                 <w:rFonts w:ascii="Arial" w:hAnsi="Arial" w:cs="Arial"/>
                 <w:lang w:eastAsia="ko-KR"/>
               </w:rPr>
-              <w:t>[</w:t>
-            </w:r>
-            <w:proofErr w:type="spellStart"/>
-            <w:r>
-              <w:rPr>
-                <w:rFonts w:ascii="Arial" w:hAnsi="Arial" w:cs="Arial"/>
-                <w:lang w:eastAsia="ko-KR"/>
-              </w:rPr>
-              <w:t>penandatangan_sppd_kabag</w:t>
-            </w:r>
-            <w:proofErr w:type="spellEnd"/>
-            <w:r>
-              <w:rPr>
-                <w:rFonts w:ascii="Arial" w:hAnsi="Arial" w:cs="Arial"/>
-                <w:lang w:eastAsia="ko-KR"/>
-              </w:rPr>
-              <w:t>]</w:t>
+              <w:t>[penandatangan_sppd_kabag]</w:t>
             </w:r>
           </w:p>
           <w:p>
@@ -5097,45 +3738,20 @@
                 <w:rFonts w:ascii="Arial" w:hAnsi="Arial" w:cs="Arial"/>
                 <w:lang w:eastAsia="ko-KR"/>
               </w:rPr>
-              <w:t>[</w:t>
-            </w:r>
-            <w:proofErr w:type="spellStart"/>
+              <w:t>[nama</w:t>
+            </w:r>
+            <w:r>
+              <w:rPr>
+                <w:rFonts w:ascii="Arial" w:hAnsi="Arial" w:cs="Arial"/>
+              </w:rPr>
+              <w:t>_</w:t>
+            </w:r>
             <w:r>
               <w:rPr>
                 <w:rFonts w:ascii="Arial" w:hAnsi="Arial" w:cs="Arial"/>
                 <w:lang w:eastAsia="ko-KR"/>
               </w:rPr>
-              <w:t>nama</w:t>
-            </w:r>
-            <w:proofErr w:type="spellEnd"/>
-            <w:r>
-              <w:rPr>
-                <w:rFonts w:ascii="Arial" w:hAnsi="Arial" w:cs="Arial"/>
-              </w:rPr>
-              <w:t>_</w:t>
-            </w:r>
-            <w:r>
-              <w:rPr>
-                <w:rFonts w:ascii="Arial" w:hAnsi="Arial" w:cs="Arial"/>
-                <w:lang w:eastAsia="ko-KR"/>
-              </w:rPr>
-              <w:t xml:space="preserve"> </w:t>
-            </w:r>
-            <w:proofErr w:type="spellStart"/>
-            <w:r>
-              <w:rPr>
-                <w:rFonts w:ascii="Arial" w:hAnsi="Arial" w:cs="Arial"/>
-                <w:lang w:eastAsia="ko-KR"/>
-              </w:rPr>
-              <w:t>penandatangan_sppd_kabag</w:t>
-            </w:r>
-            <w:proofErr w:type="spellEnd"/>
-            <w:r>
-              <w:rPr>
-                <w:rFonts w:ascii="Arial" w:hAnsi="Arial" w:cs="Arial"/>
-                <w:lang w:eastAsia="ko-KR"/>
-              </w:rPr>
-              <w:t>]</w:t>
+              <w:t xml:space="preserve"> penandatangan_sppd_kabag]</w:t>
             </w:r>
           </w:p>
           <w:p>
@@ -5158,45 +3774,20 @@
                 <w:rFonts w:ascii="Arial" w:hAnsi="Arial" w:cs="Arial"/>
                 <w:lang w:eastAsia="ko-KR"/>
               </w:rPr>
-              <w:t>[</w:t>
-            </w:r>
-            <w:proofErr w:type="spellStart"/>
+              <w:t>[pangkat</w:t>
+            </w:r>
+            <w:r>
+              <w:rPr>
+                <w:rFonts w:ascii="Arial" w:hAnsi="Arial" w:cs="Arial"/>
+              </w:rPr>
+              <w:t>_</w:t>
+            </w:r>
             <w:r>
               <w:rPr>
                 <w:rFonts w:ascii="Arial" w:hAnsi="Arial" w:cs="Arial"/>
                 <w:lang w:eastAsia="ko-KR"/>
               </w:rPr>
-              <w:t>pangkat</w:t>
-            </w:r>
-            <w:proofErr w:type="spellEnd"/>
-            <w:r>
-              <w:rPr>
-                <w:rFonts w:ascii="Arial" w:hAnsi="Arial" w:cs="Arial"/>
-              </w:rPr>
-              <w:t>_</w:t>
-            </w:r>
-            <w:r>
-              <w:rPr>
-                <w:rFonts w:ascii="Arial" w:hAnsi="Arial" w:cs="Arial"/>
-                <w:lang w:eastAsia="ko-KR"/>
-              </w:rPr>
-              <w:t xml:space="preserve"> </w:t>
-            </w:r>
-            <w:proofErr w:type="spellStart"/>
-            <w:r>
-              <w:rPr>
-                <w:rFonts w:ascii="Arial" w:hAnsi="Arial" w:cs="Arial"/>
-                <w:lang w:eastAsia="ko-KR"/>
-              </w:rPr>
-              <w:t>penandatangan_sppd_kabag</w:t>
-            </w:r>
-            <w:proofErr w:type="spellEnd"/>
-            <w:r>
-              <w:rPr>
-                <w:rFonts w:ascii="Arial" w:hAnsi="Arial" w:cs="Arial"/>
-                <w:lang w:eastAsia="ko-KR"/>
-              </w:rPr>
-              <w:t>]</w:t>
+              <w:t xml:space="preserve"> penandatangan_sppd_kabag]</w:t>
             </w:r>
           </w:p>
           <w:p>
@@ -5219,39 +3810,7 @@
                 <w:rFonts w:ascii="Arial" w:hAnsi="Arial" w:cs="Arial"/>
                 <w:lang w:eastAsia="ko-KR"/>
               </w:rPr>
-              <w:t>NIP. [</w:t>
-            </w:r>
-            <w:proofErr w:type="spellStart"/>
-            <w:r>
-              <w:rPr>
-                <w:rFonts w:ascii="Arial" w:hAnsi="Arial" w:cs="Arial"/>
-                <w:lang w:eastAsia="ko-KR"/>
-              </w:rPr>
-              <w:t>no_nip</w:t>
-            </w:r>
-            <w:proofErr w:type="spellEnd"/>
-            <w:r>
-              <w:rPr>
-                <w:rFonts w:ascii="Arial" w:hAnsi="Arial" w:cs="Arial"/>
-                <w:lang w:eastAsia="ko-KR"/>
-              </w:rPr>
-              <w:t xml:space="preserve">_ </w:t>
-            </w:r>
-            <w:proofErr w:type="spellStart"/>
-            <w:r>
-              <w:rPr>
-                <w:rFonts w:ascii="Arial" w:hAnsi="Arial" w:cs="Arial"/>
-                <w:lang w:eastAsia="ko-KR"/>
-              </w:rPr>
-              <w:t>penandatangan_sppd_kabag</w:t>
-            </w:r>
-            <w:proofErr w:type="spellEnd"/>
-            <w:r>
-              <w:rPr>
-                <w:rFonts w:ascii="Arial" w:hAnsi="Arial" w:cs="Arial"/>
-                <w:lang w:eastAsia="ko-KR"/>
-              </w:rPr>
-              <w:t>]</w:t>
+              <w:t>NIP. [no_nip_ penandatangan_sppd_kabag]</w:t>
             </w:r>
           </w:p>
           <w:p>
@@ -5330,42 +3889,12 @@
                 <w:rFonts w:ascii="Arial" w:hAnsi="Arial" w:cs="Arial"/>
               </w:rPr>
             </w:pPr>
-            <w:proofErr w:type="spellStart"/>
-            <w:r>
-              <w:rPr>
-                <w:rFonts w:ascii="Arial" w:hAnsi="Arial" w:cs="Arial"/>
-              </w:rPr>
-              <w:t>Pejabat</w:t>
-            </w:r>
-            <w:proofErr w:type="spellEnd"/>
-            <w:r>
-              <w:rPr>
-                <w:rFonts w:ascii="Arial" w:hAnsi="Arial" w:cs="Arial"/>
-              </w:rPr>
-              <w:t xml:space="preserve"> di Daerah </w:t>
-            </w:r>
-            <w:proofErr w:type="spellStart"/>
-            <w:r>
-              <w:rPr>
-                <w:rFonts w:ascii="Arial" w:hAnsi="Arial" w:cs="Arial"/>
-              </w:rPr>
-              <w:t>Penugasan</w:t>
-            </w:r>
-            <w:proofErr w:type="spellEnd"/>
-            <w:r>
-              <w:rPr>
-                <w:rFonts w:ascii="Arial" w:hAnsi="Arial" w:cs="Arial"/>
-              </w:rPr>
-              <w:t xml:space="preserve"> yang </w:t>
-            </w:r>
-            <w:proofErr w:type="spellStart"/>
-            <w:r>
-              <w:rPr>
-                <w:rFonts w:ascii="Arial" w:hAnsi="Arial" w:cs="Arial"/>
-              </w:rPr>
-              <w:t>dikunjungi</w:t>
-            </w:r>
-            <w:proofErr w:type="spellEnd"/>
+            <w:r>
+              <w:rPr>
+                <w:rFonts w:ascii="Arial" w:hAnsi="Arial" w:cs="Arial"/>
+              </w:rPr>
+              <w:t>Pejabat di Daerah Penugasan yang dikunjungi</w:t>
+            </w:r>
           </w:p>
           <w:p>
             <w:pPr>
@@ -5381,70 +3910,12 @@
                 <w:rFonts w:ascii="Arial" w:hAnsi="Arial" w:cs="Arial"/>
               </w:rPr>
             </w:pPr>
-            <w:proofErr w:type="spellStart"/>
-            <w:r>
-              <w:rPr>
-                <w:rFonts w:ascii="Arial" w:hAnsi="Arial" w:cs="Arial"/>
-              </w:rPr>
-              <w:t>Tempat</w:t>
-            </w:r>
-            <w:proofErr w:type="spellEnd"/>
-            <w:r>
-              <w:rPr>
-                <w:rFonts w:ascii="Arial" w:hAnsi="Arial" w:cs="Arial"/>
-              </w:rPr>
-              <w:t xml:space="preserve"> </w:t>
-            </w:r>
-            <w:proofErr w:type="spellStart"/>
-            <w:r>
-              <w:rPr>
-                <w:rFonts w:ascii="Arial" w:hAnsi="Arial" w:cs="Arial"/>
-              </w:rPr>
-              <w:t>Kedudukan</w:t>
-            </w:r>
-            <w:proofErr w:type="spellEnd"/>
-            <w:r>
-              <w:rPr>
-                <w:rFonts w:ascii="Arial" w:hAnsi="Arial" w:cs="Arial"/>
-              </w:rPr>
-              <w:t xml:space="preserve"> </w:t>
-            </w:r>
-            <w:proofErr w:type="spellStart"/>
-            <w:r>
-              <w:rPr>
-                <w:rFonts w:ascii="Arial" w:hAnsi="Arial" w:cs="Arial"/>
-              </w:rPr>
-              <w:t>Pegawai</w:t>
-            </w:r>
-            <w:proofErr w:type="spellEnd"/>
-            <w:r>
-              <w:rPr>
-                <w:rFonts w:ascii="Arial" w:hAnsi="Arial" w:cs="Arial"/>
-              </w:rPr>
-              <w:t xml:space="preserve"> </w:t>
-            </w:r>
-            <w:proofErr w:type="spellStart"/>
-            <w:r>
-              <w:rPr>
-                <w:rFonts w:ascii="Arial" w:hAnsi="Arial" w:cs="Arial"/>
-              </w:rPr>
-              <w:t>Melaksanakan</w:t>
-            </w:r>
-            <w:proofErr w:type="spellEnd"/>
-            <w:r>
-              <w:rPr>
-                <w:rFonts w:ascii="Arial" w:hAnsi="Arial" w:cs="Arial"/>
-              </w:rPr>
-              <w:t xml:space="preserve"> </w:t>
-            </w:r>
-            <w:proofErr w:type="spellStart"/>
-            <w:r>
-              <w:rPr>
-                <w:rFonts w:ascii="Arial" w:hAnsi="Arial" w:cs="Arial"/>
-              </w:rPr>
-              <w:t>Perintah</w:t>
-            </w:r>
-            <w:proofErr w:type="spellEnd"/>
+            <w:r>
+              <w:rPr>
+                <w:rFonts w:ascii="Arial" w:hAnsi="Arial" w:cs="Arial"/>
+              </w:rPr>
+              <w:t>Tempat Kedudukan Pegawai Melaksanakan Perintah</w:t>
+            </w:r>
           </w:p>
           <w:p>
             <w:pPr>
@@ -5470,41 +3941,14 @@
               <w:rPr>
                 <w:color w:val="000000" w:themeColor="text1"/>
               </w:rPr>
-              <w:t>${</w:t>
-            </w:r>
-            <w:proofErr w:type="spellStart"/>
-            <w:r>
-              <w:rPr>
-                <w:color w:val="000000" w:themeColor="text1"/>
-              </w:rPr>
-              <w:t>block_name</w:t>
-            </w:r>
-            <w:proofErr w:type="spellEnd"/>
-            <w:r>
-              <w:rPr>
-                <w:color w:val="000000" w:themeColor="text1"/>
-              </w:rPr>
-              <w:t>}</w:t>
+              <w:t>${block_name}</w:t>
             </w:r>
             <w:r>
               <w:rPr>
                 <w:rFonts w:ascii="Arial" w:hAnsi="Arial" w:cs="Arial"/>
               </w:rPr>
               <w:br/>
-            </w:r>
-            <w:proofErr w:type="spellStart"/>
-            <w:r>
-              <w:rPr>
-                <w:rFonts w:ascii="Arial" w:hAnsi="Arial" w:cs="Arial"/>
-              </w:rPr>
-              <w:t>Tiba</w:t>
-            </w:r>
-            <w:proofErr w:type="spellEnd"/>
-            <w:r>
-              <w:rPr>
-                <w:rFonts w:ascii="Arial" w:hAnsi="Arial" w:cs="Arial"/>
-              </w:rPr>
-              <w:t xml:space="preserve"> di</w:t>
+              <w:t>Tiba di</w:t>
             </w:r>
             <w:r>
               <w:rPr>
@@ -5523,37 +3967,15 @@
               <w:rPr>
                 <w:rFonts w:ascii="Arial" w:hAnsi="Arial" w:cs="Arial"/>
               </w:rPr>
-              <w:t>${</w:t>
-            </w:r>
-            <w:proofErr w:type="spellStart"/>
-            <w:r>
-              <w:rPr>
-                <w:rFonts w:ascii="Arial" w:hAnsi="Arial" w:cs="Arial"/>
-              </w:rPr>
-              <w:t>place_from</w:t>
-            </w:r>
-            <w:proofErr w:type="spellEnd"/>
-            <w:r>
-              <w:rPr>
-                <w:rFonts w:ascii="Arial" w:hAnsi="Arial" w:cs="Arial"/>
-              </w:rPr>
-              <w:t>}</w:t>
+              <w:t>${place_from}</w:t>
             </w:r>
             <w:r>
               <w:rPr>
                 <w:rFonts w:ascii="Arial" w:hAnsi="Arial" w:cs="Arial"/>
               </w:rPr>
               <w:tab/>
-              <w:t xml:space="preserve">Kembali </w:t>
-            </w:r>
-            <w:proofErr w:type="spellStart"/>
-            <w:r>
-              <w:rPr>
-                <w:rFonts w:ascii="Arial" w:hAnsi="Arial" w:cs="Arial"/>
-              </w:rPr>
-              <w:t>dari</w:t>
-            </w:r>
-            <w:proofErr w:type="spellEnd"/>
+              <w:t>Kembali dari</w:t>
+            </w:r>
             <w:r>
               <w:rPr>
                 <w:rFonts w:ascii="Arial" w:hAnsi="Arial" w:cs="Arial"/>
@@ -5571,37 +3993,15 @@
               <w:rPr>
                 <w:rFonts w:ascii="Arial" w:hAnsi="Arial" w:cs="Arial"/>
               </w:rPr>
-              <w:t>${</w:t>
-            </w:r>
-            <w:proofErr w:type="spellStart"/>
-            <w:r>
-              <w:rPr>
-                <w:rFonts w:ascii="Arial" w:hAnsi="Arial" w:cs="Arial"/>
-              </w:rPr>
-              <w:t>date_back</w:t>
-            </w:r>
-            <w:proofErr w:type="spellEnd"/>
-            <w:r>
-              <w:rPr>
-                <w:rFonts w:ascii="Arial" w:hAnsi="Arial" w:cs="Arial"/>
-              </w:rPr>
-              <w:t>}</w:t>
+              <w:t>${date_back}</w:t>
             </w:r>
             <w:r>
               <w:rPr>
                 <w:rFonts w:ascii="Arial" w:hAnsi="Arial" w:cs="Arial"/>
               </w:rPr>
               <w:br/>
-              <w:t xml:space="preserve">Pada </w:t>
-            </w:r>
-            <w:proofErr w:type="spellStart"/>
-            <w:r>
-              <w:rPr>
-                <w:rFonts w:ascii="Arial" w:hAnsi="Arial" w:cs="Arial"/>
-              </w:rPr>
-              <w:t>Tanggal</w:t>
-            </w:r>
-            <w:proofErr w:type="spellEnd"/>
+              <w:t>Pada Tanggal</w:t>
+            </w:r>
             <w:r>
               <w:rPr>
                 <w:rFonts w:ascii="Arial" w:hAnsi="Arial" w:cs="Arial"/>
@@ -5619,37 +4019,15 @@
               <w:rPr>
                 <w:rFonts w:ascii="Arial" w:hAnsi="Arial" w:cs="Arial"/>
               </w:rPr>
-              <w:t>${</w:t>
-            </w:r>
-            <w:proofErr w:type="spellStart"/>
-            <w:r>
-              <w:rPr>
-                <w:rFonts w:ascii="Arial" w:hAnsi="Arial" w:cs="Arial"/>
-              </w:rPr>
-              <w:t>date_go</w:t>
-            </w:r>
-            <w:proofErr w:type="spellEnd"/>
-            <w:r>
-              <w:rPr>
-                <w:rFonts w:ascii="Arial" w:hAnsi="Arial" w:cs="Arial"/>
-              </w:rPr>
-              <w:t>}</w:t>
+              <w:t>${date_go}</w:t>
             </w:r>
             <w:r>
               <w:rPr>
                 <w:rFonts w:ascii="Arial" w:hAnsi="Arial" w:cs="Arial"/>
               </w:rPr>
               <w:tab/>
-              <w:t xml:space="preserve">Pada </w:t>
-            </w:r>
-            <w:proofErr w:type="spellStart"/>
-            <w:r>
-              <w:rPr>
-                <w:rFonts w:ascii="Arial" w:hAnsi="Arial" w:cs="Arial"/>
-              </w:rPr>
-              <w:t>Tanggal</w:t>
-            </w:r>
-            <w:proofErr w:type="spellEnd"/>
+              <w:t>Pada Tanggal</w:t>
+            </w:r>
             <w:r>
               <w:rPr>
                 <w:rFonts w:ascii="Arial" w:hAnsi="Arial" w:cs="Arial"/>
@@ -5667,21 +4045,7 @@
               <w:rPr>
                 <w:rFonts w:ascii="Arial" w:hAnsi="Arial" w:cs="Arial"/>
               </w:rPr>
-              <w:t>${</w:t>
-            </w:r>
-            <w:proofErr w:type="spellStart"/>
-            <w:r>
-              <w:rPr>
-                <w:rFonts w:ascii="Arial" w:hAnsi="Arial" w:cs="Arial"/>
-              </w:rPr>
-              <w:t>date_back</w:t>
-            </w:r>
-            <w:proofErr w:type="spellEnd"/>
-            <w:r>
-              <w:rPr>
-                <w:rFonts w:ascii="Arial" w:hAnsi="Arial" w:cs="Arial"/>
-              </w:rPr>
-              <w:t>}</w:t>
+              <w:t>${date_back}</w:t>
             </w:r>
           </w:p>
           <w:p>
@@ -5712,21 +4076,7 @@
               <w:rPr>
                 <w:color w:val="000000" w:themeColor="text1"/>
               </w:rPr>
-              <w:t>${/</w:t>
-            </w:r>
-            <w:proofErr w:type="spellStart"/>
-            <w:r>
-              <w:rPr>
-                <w:color w:val="000000" w:themeColor="text1"/>
-              </w:rPr>
-              <w:t>block_name</w:t>
-            </w:r>
-            <w:proofErr w:type="spellEnd"/>
-            <w:r>
-              <w:rPr>
-                <w:color w:val="000000" w:themeColor="text1"/>
-              </w:rPr>
-              <w:t>}</w:t>
+              <w:t>${/block_name}</w:t>
             </w:r>
           </w:p>
           <w:p>
@@ -5915,240 +4265,7 @@
           <w:szCs w:val="20"/>
         </w:rPr>
         <w:tab/>
-      </w:r>
-      <w:proofErr w:type="spellStart"/>
-      <w:r>
-        <w:rPr>
-          <w:rFonts w:ascii="Arial" w:hAnsi="Arial" w:cs="Arial"/>
-          <w:sz w:val="20"/>
-          <w:szCs w:val="20"/>
-        </w:rPr>
-        <w:t>Selambat-lambatnya</w:t>
-      </w:r>
-      <w:proofErr w:type="spellEnd"/>
-      <w:r>
-        <w:rPr>
-          <w:rFonts w:ascii="Arial" w:hAnsi="Arial" w:cs="Arial"/>
-          <w:sz w:val="20"/>
-          <w:szCs w:val="20"/>
-        </w:rPr>
-        <w:t xml:space="preserve"> 7 (</w:t>
-      </w:r>
-      <w:proofErr w:type="spellStart"/>
-      <w:r>
-        <w:rPr>
-          <w:rFonts w:ascii="Arial" w:hAnsi="Arial" w:cs="Arial"/>
-          <w:sz w:val="20"/>
-          <w:szCs w:val="20"/>
-        </w:rPr>
-        <w:t>tujuh</w:t>
-      </w:r>
-      <w:proofErr w:type="spellEnd"/>
-      <w:r>
-        <w:rPr>
-          <w:rFonts w:ascii="Arial" w:hAnsi="Arial" w:cs="Arial"/>
-          <w:sz w:val="20"/>
-          <w:szCs w:val="20"/>
-        </w:rPr>
-        <w:t xml:space="preserve">) </w:t>
-      </w:r>
-      <w:proofErr w:type="spellStart"/>
-      <w:r>
-        <w:rPr>
-          <w:rFonts w:ascii="Arial" w:hAnsi="Arial" w:cs="Arial"/>
-          <w:sz w:val="20"/>
-          <w:szCs w:val="20"/>
-        </w:rPr>
-        <w:t>hari</w:t>
-      </w:r>
-      <w:proofErr w:type="spellEnd"/>
-      <w:r>
-        <w:rPr>
-          <w:rFonts w:ascii="Arial" w:hAnsi="Arial" w:cs="Arial"/>
-          <w:sz w:val="20"/>
-          <w:szCs w:val="20"/>
-        </w:rPr>
-        <w:t xml:space="preserve"> </w:t>
-      </w:r>
-      <w:proofErr w:type="spellStart"/>
-      <w:r>
-        <w:rPr>
-          <w:rFonts w:ascii="Arial" w:hAnsi="Arial" w:cs="Arial"/>
-          <w:sz w:val="20"/>
-          <w:szCs w:val="20"/>
-        </w:rPr>
-        <w:t>setelah</w:t>
-      </w:r>
-      <w:proofErr w:type="spellEnd"/>
-      <w:r>
-        <w:rPr>
-          <w:rFonts w:ascii="Arial" w:hAnsi="Arial" w:cs="Arial"/>
-          <w:sz w:val="20"/>
-          <w:szCs w:val="20"/>
-        </w:rPr>
-        <w:t xml:space="preserve"> </w:t>
-      </w:r>
-      <w:proofErr w:type="spellStart"/>
-      <w:r>
-        <w:rPr>
-          <w:rFonts w:ascii="Arial" w:hAnsi="Arial" w:cs="Arial"/>
-          <w:sz w:val="20"/>
-          <w:szCs w:val="20"/>
-        </w:rPr>
-        <w:t>perjalanan</w:t>
-      </w:r>
-      <w:proofErr w:type="spellEnd"/>
-      <w:r>
-        <w:rPr>
-          <w:rFonts w:ascii="Arial" w:hAnsi="Arial" w:cs="Arial"/>
-          <w:sz w:val="20"/>
-          <w:szCs w:val="20"/>
-        </w:rPr>
-        <w:t xml:space="preserve"> </w:t>
-      </w:r>
-      <w:proofErr w:type="spellStart"/>
-      <w:r>
-        <w:rPr>
-          <w:rFonts w:ascii="Arial" w:hAnsi="Arial" w:cs="Arial"/>
-          <w:sz w:val="20"/>
-          <w:szCs w:val="20"/>
-        </w:rPr>
-        <w:t>dinas</w:t>
-      </w:r>
-      <w:proofErr w:type="spellEnd"/>
-      <w:r>
-        <w:rPr>
-          <w:rFonts w:ascii="Arial" w:hAnsi="Arial" w:cs="Arial"/>
-          <w:sz w:val="20"/>
-          <w:szCs w:val="20"/>
-        </w:rPr>
-        <w:t xml:space="preserve"> </w:t>
-      </w:r>
-      <w:proofErr w:type="spellStart"/>
-      <w:r>
-        <w:rPr>
-          <w:rFonts w:ascii="Arial" w:hAnsi="Arial" w:cs="Arial"/>
-          <w:sz w:val="20"/>
-          <w:szCs w:val="20"/>
-        </w:rPr>
-        <w:t>berakhir</w:t>
-      </w:r>
-      <w:proofErr w:type="spellEnd"/>
-      <w:r>
-        <w:rPr>
-          <w:rFonts w:ascii="Arial" w:hAnsi="Arial" w:cs="Arial"/>
-          <w:sz w:val="20"/>
-          <w:szCs w:val="20"/>
-        </w:rPr>
-        <w:t xml:space="preserve">, SPPD </w:t>
-      </w:r>
-      <w:proofErr w:type="spellStart"/>
-      <w:r>
-        <w:rPr>
-          <w:rFonts w:ascii="Arial" w:hAnsi="Arial" w:cs="Arial"/>
-          <w:sz w:val="20"/>
-          <w:szCs w:val="20"/>
-        </w:rPr>
-        <w:t>harus</w:t>
-      </w:r>
-      <w:proofErr w:type="spellEnd"/>
-      <w:r>
-        <w:rPr>
-          <w:rFonts w:ascii="Arial" w:hAnsi="Arial" w:cs="Arial"/>
-          <w:sz w:val="20"/>
-          <w:szCs w:val="20"/>
-        </w:rPr>
-        <w:t xml:space="preserve"> </w:t>
-      </w:r>
-      <w:proofErr w:type="spellStart"/>
-      <w:r>
-        <w:rPr>
-          <w:rFonts w:ascii="Arial" w:hAnsi="Arial" w:cs="Arial"/>
-          <w:sz w:val="20"/>
-          <w:szCs w:val="20"/>
-        </w:rPr>
-        <w:t>sudah</w:t>
-      </w:r>
-      <w:proofErr w:type="spellEnd"/>
-      <w:r>
-        <w:rPr>
-          <w:rFonts w:ascii="Arial" w:hAnsi="Arial" w:cs="Arial"/>
-          <w:sz w:val="20"/>
-          <w:szCs w:val="20"/>
-        </w:rPr>
-        <w:t xml:space="preserve"> </w:t>
-      </w:r>
-      <w:proofErr w:type="spellStart"/>
-      <w:r>
-        <w:rPr>
-          <w:rFonts w:ascii="Arial" w:hAnsi="Arial" w:cs="Arial"/>
-          <w:sz w:val="20"/>
-          <w:szCs w:val="20"/>
-        </w:rPr>
-        <w:t>diserahkan</w:t>
-      </w:r>
-      <w:proofErr w:type="spellEnd"/>
-      <w:r>
-        <w:rPr>
-          <w:rFonts w:ascii="Arial" w:hAnsi="Arial" w:cs="Arial"/>
-          <w:sz w:val="20"/>
-          <w:szCs w:val="20"/>
-        </w:rPr>
-        <w:t xml:space="preserve"> </w:t>
-      </w:r>
-      <w:proofErr w:type="spellStart"/>
-      <w:r>
-        <w:rPr>
-          <w:rFonts w:ascii="Arial" w:hAnsi="Arial" w:cs="Arial"/>
-          <w:sz w:val="20"/>
-          <w:szCs w:val="20"/>
-        </w:rPr>
-        <w:t>kepada</w:t>
-      </w:r>
-      <w:proofErr w:type="spellEnd"/>
-      <w:r>
-        <w:rPr>
-          <w:rFonts w:ascii="Arial" w:hAnsi="Arial" w:cs="Arial"/>
-          <w:sz w:val="20"/>
-          <w:szCs w:val="20"/>
-        </w:rPr>
-        <w:t xml:space="preserve"> </w:t>
-      </w:r>
-      <w:proofErr w:type="spellStart"/>
-      <w:r>
-        <w:rPr>
-          <w:rFonts w:ascii="Arial" w:hAnsi="Arial" w:cs="Arial"/>
-          <w:sz w:val="20"/>
-          <w:szCs w:val="20"/>
-        </w:rPr>
-        <w:t>bendahara</w:t>
-      </w:r>
-      <w:proofErr w:type="spellEnd"/>
-      <w:r>
-        <w:rPr>
-          <w:rFonts w:ascii="Arial" w:hAnsi="Arial" w:cs="Arial"/>
-          <w:sz w:val="20"/>
-          <w:szCs w:val="20"/>
-        </w:rPr>
-        <w:t xml:space="preserve"> yang </w:t>
-      </w:r>
-      <w:proofErr w:type="spellStart"/>
-      <w:r>
-        <w:rPr>
-          <w:rFonts w:ascii="Arial" w:hAnsi="Arial" w:cs="Arial"/>
-          <w:sz w:val="20"/>
-          <w:szCs w:val="20"/>
-        </w:rPr>
-        <w:t>bersangkutan</w:t>
-      </w:r>
-      <w:proofErr w:type="spellEnd"/>
-      <w:r>
-        <w:rPr>
-          <w:rFonts w:ascii="Arial" w:hAnsi="Arial" w:cs="Arial"/>
-          <w:sz w:val="20"/>
-          <w:szCs w:val="20"/>
-        </w:rPr>
-        <w:t>.</w:t>
+        <w:t>Selambat-lambatnya 7 (tujuh) hari setelah perjalanan dinas berakhir, SPPD harus sudah diserahkan kepada bendahara yang bersangkutan.</w:t>
       </w:r>
     </w:p>
     <w:p>
@@ -6172,16 +4289,14 @@
           <w:szCs w:val="20"/>
         </w:rPr>
       </w:pPr>
-      <w:proofErr w:type="spellStart"/>
       <w:r>
         <w:rPr>
           <w:rFonts w:ascii="Arial" w:hAnsi="Arial" w:cs="Arial"/>
           <w:sz w:val="20"/>
           <w:szCs w:val="20"/>
         </w:rPr>
-        <w:t>Apabila</w:t>
-      </w:r>
-      <w:proofErr w:type="spellEnd"/>
+        <w:t>Apabila ketentuan tersebut pada butir 1(satu) tidak dipenuhi, maka semua biayayang telah diberikan akan ditarik dengan memperhitungkan dari gaji yang bersangkutan</w:t>
+      </w:r>
       <w:r>
         <w:rPr>
           <w:rFonts w:ascii="Arial" w:hAnsi="Arial" w:cs="Arial"/>
@@ -6190,401 +4305,13 @@
         </w:rPr>
         <w:t xml:space="preserve"> </w:t>
       </w:r>
-      <w:proofErr w:type="spellStart"/>
       <w:r>
         <w:rPr>
           <w:rFonts w:ascii="Arial" w:hAnsi="Arial" w:cs="Arial"/>
           <w:sz w:val="20"/>
           <w:szCs w:val="20"/>
         </w:rPr>
-        <w:t>ketentuan</w:t>
-      </w:r>
-      <w:proofErr w:type="spellEnd"/>
-      <w:r>
-        <w:rPr>
-          <w:rFonts w:ascii="Arial" w:hAnsi="Arial" w:cs="Arial"/>
-          <w:sz w:val="20"/>
-          <w:szCs w:val="20"/>
-        </w:rPr>
-        <w:t xml:space="preserve"> </w:t>
-      </w:r>
-      <w:proofErr w:type="spellStart"/>
-      <w:r>
-        <w:rPr>
-          <w:rFonts w:ascii="Arial" w:hAnsi="Arial" w:cs="Arial"/>
-          <w:sz w:val="20"/>
-          <w:szCs w:val="20"/>
-        </w:rPr>
-        <w:t>tersebut</w:t>
-      </w:r>
-      <w:proofErr w:type="spellEnd"/>
-      <w:r>
-        <w:rPr>
-          <w:rFonts w:ascii="Arial" w:hAnsi="Arial" w:cs="Arial"/>
-          <w:sz w:val="20"/>
-          <w:szCs w:val="20"/>
-        </w:rPr>
-        <w:t xml:space="preserve"> pada </w:t>
-      </w:r>
-      <w:proofErr w:type="spellStart"/>
-      <w:r>
-        <w:rPr>
-          <w:rFonts w:ascii="Arial" w:hAnsi="Arial" w:cs="Arial"/>
-          <w:sz w:val="20"/>
-          <w:szCs w:val="20"/>
-        </w:rPr>
-        <w:t>butir</w:t>
-      </w:r>
-      <w:proofErr w:type="spellEnd"/>
-      <w:r>
-        <w:rPr>
-          <w:rFonts w:ascii="Arial" w:hAnsi="Arial" w:cs="Arial"/>
-          <w:sz w:val="20"/>
-          <w:szCs w:val="20"/>
-        </w:rPr>
-        <w:t xml:space="preserve"> 1(</w:t>
-      </w:r>
-      <w:proofErr w:type="spellStart"/>
-      <w:r>
-        <w:rPr>
-          <w:rFonts w:ascii="Arial" w:hAnsi="Arial" w:cs="Arial"/>
-          <w:sz w:val="20"/>
-          <w:szCs w:val="20"/>
-        </w:rPr>
-        <w:t>satu</w:t>
-      </w:r>
-      <w:proofErr w:type="spellEnd"/>
-      <w:r>
-        <w:rPr>
-          <w:rFonts w:ascii="Arial" w:hAnsi="Arial" w:cs="Arial"/>
-          <w:sz w:val="20"/>
-          <w:szCs w:val="20"/>
-        </w:rPr>
-        <w:t xml:space="preserve">) </w:t>
-      </w:r>
-      <w:proofErr w:type="spellStart"/>
-      <w:r>
-        <w:rPr>
-          <w:rFonts w:ascii="Arial" w:hAnsi="Arial" w:cs="Arial"/>
-          <w:sz w:val="20"/>
-          <w:szCs w:val="20"/>
-        </w:rPr>
-        <w:t>tidak</w:t>
-      </w:r>
-      <w:proofErr w:type="spellEnd"/>
-      <w:r>
-        <w:rPr>
-          <w:rFonts w:ascii="Arial" w:hAnsi="Arial" w:cs="Arial"/>
-          <w:sz w:val="20"/>
-          <w:szCs w:val="20"/>
-        </w:rPr>
-        <w:t xml:space="preserve"> </w:t>
-      </w:r>
-      <w:proofErr w:type="spellStart"/>
-      <w:r>
-        <w:rPr>
-          <w:rFonts w:ascii="Arial" w:hAnsi="Arial" w:cs="Arial"/>
-          <w:sz w:val="20"/>
-          <w:szCs w:val="20"/>
-        </w:rPr>
-        <w:t>dipenuhi</w:t>
-      </w:r>
-      <w:proofErr w:type="spellEnd"/>
-      <w:r>
-        <w:rPr>
-          <w:rFonts w:ascii="Arial" w:hAnsi="Arial" w:cs="Arial"/>
-          <w:sz w:val="20"/>
-          <w:szCs w:val="20"/>
-        </w:rPr>
-        <w:t xml:space="preserve">, </w:t>
-      </w:r>
-      <w:proofErr w:type="spellStart"/>
-      <w:r>
-        <w:rPr>
-          <w:rFonts w:ascii="Arial" w:hAnsi="Arial" w:cs="Arial"/>
-          <w:sz w:val="20"/>
-          <w:szCs w:val="20"/>
-        </w:rPr>
-        <w:t>maka</w:t>
-      </w:r>
-      <w:proofErr w:type="spellEnd"/>
-      <w:r>
-        <w:rPr>
-          <w:rFonts w:ascii="Arial" w:hAnsi="Arial" w:cs="Arial"/>
-          <w:sz w:val="20"/>
-          <w:szCs w:val="20"/>
-        </w:rPr>
-        <w:t xml:space="preserve"> </w:t>
-      </w:r>
-      <w:proofErr w:type="spellStart"/>
-      <w:r>
-        <w:rPr>
-          <w:rFonts w:ascii="Arial" w:hAnsi="Arial" w:cs="Arial"/>
-          <w:sz w:val="20"/>
-          <w:szCs w:val="20"/>
-        </w:rPr>
-        <w:t>semua</w:t>
-      </w:r>
-      <w:proofErr w:type="spellEnd"/>
-      <w:r>
-        <w:rPr>
-          <w:rFonts w:ascii="Arial" w:hAnsi="Arial" w:cs="Arial"/>
-          <w:sz w:val="20"/>
-          <w:szCs w:val="20"/>
-        </w:rPr>
-        <w:t xml:space="preserve"> </w:t>
-      </w:r>
-      <w:proofErr w:type="spellStart"/>
-      <w:r>
-        <w:rPr>
-          <w:rFonts w:ascii="Arial" w:hAnsi="Arial" w:cs="Arial"/>
-          <w:sz w:val="20"/>
-          <w:szCs w:val="20"/>
-        </w:rPr>
-        <w:t>biayayang</w:t>
-      </w:r>
-      <w:proofErr w:type="spellEnd"/>
-      <w:r>
-        <w:rPr>
-          <w:rFonts w:ascii="Arial" w:hAnsi="Arial" w:cs="Arial"/>
-          <w:sz w:val="20"/>
-          <w:szCs w:val="20"/>
-        </w:rPr>
-        <w:t xml:space="preserve"> </w:t>
-      </w:r>
-      <w:proofErr w:type="spellStart"/>
-      <w:r>
-        <w:rPr>
-          <w:rFonts w:ascii="Arial" w:hAnsi="Arial" w:cs="Arial"/>
-          <w:sz w:val="20"/>
-          <w:szCs w:val="20"/>
-        </w:rPr>
-        <w:t>telah</w:t>
-      </w:r>
-      <w:proofErr w:type="spellEnd"/>
-      <w:r>
-        <w:rPr>
-          <w:rFonts w:ascii="Arial" w:hAnsi="Arial" w:cs="Arial"/>
-          <w:sz w:val="20"/>
-          <w:szCs w:val="20"/>
-        </w:rPr>
-        <w:t xml:space="preserve"> </w:t>
-      </w:r>
-      <w:proofErr w:type="spellStart"/>
-      <w:r>
-        <w:rPr>
-          <w:rFonts w:ascii="Arial" w:hAnsi="Arial" w:cs="Arial"/>
-          <w:sz w:val="20"/>
-          <w:szCs w:val="20"/>
-        </w:rPr>
-        <w:t>diberikan</w:t>
-      </w:r>
-      <w:proofErr w:type="spellEnd"/>
-      <w:r>
-        <w:rPr>
-          <w:rFonts w:ascii="Arial" w:hAnsi="Arial" w:cs="Arial"/>
-          <w:sz w:val="20"/>
-          <w:szCs w:val="20"/>
-        </w:rPr>
-        <w:t xml:space="preserve"> </w:t>
-      </w:r>
-      <w:proofErr w:type="spellStart"/>
-      <w:r>
-        <w:rPr>
-          <w:rFonts w:ascii="Arial" w:hAnsi="Arial" w:cs="Arial"/>
-          <w:sz w:val="20"/>
-          <w:szCs w:val="20"/>
-        </w:rPr>
-        <w:t>akan</w:t>
-      </w:r>
-      <w:proofErr w:type="spellEnd"/>
-      <w:r>
-        <w:rPr>
-          <w:rFonts w:ascii="Arial" w:hAnsi="Arial" w:cs="Arial"/>
-          <w:sz w:val="20"/>
-          <w:szCs w:val="20"/>
-        </w:rPr>
-        <w:t xml:space="preserve"> </w:t>
-      </w:r>
-      <w:proofErr w:type="spellStart"/>
-      <w:r>
-        <w:rPr>
-          <w:rFonts w:ascii="Arial" w:hAnsi="Arial" w:cs="Arial"/>
-          <w:sz w:val="20"/>
-          <w:szCs w:val="20"/>
-        </w:rPr>
-        <w:t>ditarik</w:t>
-      </w:r>
-      <w:proofErr w:type="spellEnd"/>
-      <w:r>
-        <w:rPr>
-          <w:rFonts w:ascii="Arial" w:hAnsi="Arial" w:cs="Arial"/>
-          <w:sz w:val="20"/>
-          <w:szCs w:val="20"/>
-        </w:rPr>
-        <w:t xml:space="preserve"> </w:t>
-      </w:r>
-      <w:proofErr w:type="spellStart"/>
-      <w:r>
-        <w:rPr>
-          <w:rFonts w:ascii="Arial" w:hAnsi="Arial" w:cs="Arial"/>
-          <w:sz w:val="20"/>
-          <w:szCs w:val="20"/>
-        </w:rPr>
-        <w:t>dengan</w:t>
-      </w:r>
-      <w:proofErr w:type="spellEnd"/>
-      <w:r>
-        <w:rPr>
-          <w:rFonts w:ascii="Arial" w:hAnsi="Arial" w:cs="Arial"/>
-          <w:sz w:val="20"/>
-          <w:szCs w:val="20"/>
-        </w:rPr>
-        <w:t xml:space="preserve"> </w:t>
-      </w:r>
-      <w:proofErr w:type="spellStart"/>
-      <w:r>
-        <w:rPr>
-          <w:rFonts w:ascii="Arial" w:hAnsi="Arial" w:cs="Arial"/>
-          <w:sz w:val="20"/>
-          <w:szCs w:val="20"/>
-        </w:rPr>
-        <w:t>memperhitungkan</w:t>
-      </w:r>
-      <w:proofErr w:type="spellEnd"/>
-      <w:r>
-        <w:rPr>
-          <w:rFonts w:ascii="Arial" w:hAnsi="Arial" w:cs="Arial"/>
-          <w:sz w:val="20"/>
-          <w:szCs w:val="20"/>
-        </w:rPr>
-        <w:t xml:space="preserve"> </w:t>
-      </w:r>
-      <w:proofErr w:type="spellStart"/>
-      <w:r>
-        <w:rPr>
-          <w:rFonts w:ascii="Arial" w:hAnsi="Arial" w:cs="Arial"/>
-          <w:sz w:val="20"/>
-          <w:szCs w:val="20"/>
-        </w:rPr>
-        <w:t>dari</w:t>
-      </w:r>
-      <w:proofErr w:type="spellEnd"/>
-      <w:r>
-        <w:rPr>
-          <w:rFonts w:ascii="Arial" w:hAnsi="Arial" w:cs="Arial"/>
-          <w:sz w:val="20"/>
-          <w:szCs w:val="20"/>
-        </w:rPr>
-        <w:t xml:space="preserve"> </w:t>
-      </w:r>
-      <w:proofErr w:type="spellStart"/>
-      <w:r>
-        <w:rPr>
-          <w:rFonts w:ascii="Arial" w:hAnsi="Arial" w:cs="Arial"/>
-          <w:sz w:val="20"/>
-          <w:szCs w:val="20"/>
-        </w:rPr>
-        <w:t>gaji</w:t>
-      </w:r>
-      <w:proofErr w:type="spellEnd"/>
-      <w:r>
-        <w:rPr>
-          <w:rFonts w:ascii="Arial" w:hAnsi="Arial" w:cs="Arial"/>
-          <w:sz w:val="20"/>
-          <w:szCs w:val="20"/>
-        </w:rPr>
-        <w:t xml:space="preserve"> yang </w:t>
-      </w:r>
-      <w:proofErr w:type="spellStart"/>
-      <w:r>
-        <w:rPr>
-          <w:rFonts w:ascii="Arial" w:hAnsi="Arial" w:cs="Arial"/>
-          <w:sz w:val="20"/>
-          <w:szCs w:val="20"/>
-        </w:rPr>
-        <w:t>bersangkutan</w:t>
-      </w:r>
-      <w:proofErr w:type="spellEnd"/>
-      <w:r>
-        <w:rPr>
-          <w:rFonts w:ascii="Arial" w:hAnsi="Arial" w:cs="Arial"/>
-          <w:sz w:val="20"/>
-          <w:szCs w:val="20"/>
-        </w:rPr>
-        <w:t xml:space="preserve"> </w:t>
-      </w:r>
-      <w:proofErr w:type="spellStart"/>
-      <w:r>
-        <w:rPr>
-          <w:rFonts w:ascii="Arial" w:hAnsi="Arial" w:cs="Arial"/>
-          <w:sz w:val="20"/>
-          <w:szCs w:val="20"/>
-        </w:rPr>
-        <w:t>sesuai</w:t>
-      </w:r>
-      <w:proofErr w:type="spellEnd"/>
-      <w:r>
-        <w:rPr>
-          <w:rFonts w:ascii="Arial" w:hAnsi="Arial" w:cs="Arial"/>
-          <w:sz w:val="20"/>
-          <w:szCs w:val="20"/>
-        </w:rPr>
-        <w:t xml:space="preserve"> </w:t>
-      </w:r>
-      <w:proofErr w:type="spellStart"/>
-      <w:r>
-        <w:rPr>
-          <w:rFonts w:ascii="Arial" w:hAnsi="Arial" w:cs="Arial"/>
-          <w:sz w:val="20"/>
-          <w:szCs w:val="20"/>
-        </w:rPr>
-        <w:t>dengan</w:t>
-      </w:r>
-      <w:proofErr w:type="spellEnd"/>
-      <w:r>
-        <w:rPr>
-          <w:rFonts w:ascii="Arial" w:hAnsi="Arial" w:cs="Arial"/>
-          <w:sz w:val="20"/>
-          <w:szCs w:val="20"/>
-        </w:rPr>
-        <w:t xml:space="preserve"> </w:t>
-      </w:r>
-      <w:proofErr w:type="spellStart"/>
-      <w:r>
-        <w:rPr>
-          <w:rFonts w:ascii="Arial" w:hAnsi="Arial" w:cs="Arial"/>
-          <w:sz w:val="20"/>
-          <w:szCs w:val="20"/>
-        </w:rPr>
-        <w:t>peraturan</w:t>
-      </w:r>
-      <w:proofErr w:type="spellEnd"/>
-      <w:r>
-        <w:rPr>
-          <w:rFonts w:ascii="Arial" w:hAnsi="Arial" w:cs="Arial"/>
-          <w:sz w:val="20"/>
-          <w:szCs w:val="20"/>
-        </w:rPr>
-        <w:t xml:space="preserve"> </w:t>
-      </w:r>
-      <w:proofErr w:type="spellStart"/>
-      <w:r>
-        <w:rPr>
-          <w:rFonts w:ascii="Arial" w:hAnsi="Arial" w:cs="Arial"/>
-          <w:sz w:val="20"/>
-          <w:szCs w:val="20"/>
-        </w:rPr>
-        <w:t>perundang-undangan</w:t>
-      </w:r>
-      <w:proofErr w:type="spellEnd"/>
-      <w:r>
-        <w:rPr>
-          <w:rFonts w:ascii="Arial" w:hAnsi="Arial" w:cs="Arial"/>
-          <w:sz w:val="20"/>
-          <w:szCs w:val="20"/>
-        </w:rPr>
-        <w:t>.</w:t>
+        <w:t>sesuai dengan peraturan perundang-undangan.</w:t>
       </w:r>
     </w:p>
     <w:p>
@@ -6606,437 +4333,13 @@
           <w:szCs w:val="20"/>
         </w:rPr>
       </w:pPr>
-      <w:proofErr w:type="spellStart"/>
       <w:r>
         <w:rPr>
           <w:rFonts w:ascii="Arial" w:hAnsi="Arial" w:cs="Arial"/>
           <w:sz w:val="20"/>
           <w:szCs w:val="20"/>
         </w:rPr>
-        <w:t>Pejabat</w:t>
-      </w:r>
-      <w:proofErr w:type="spellEnd"/>
-      <w:r>
-        <w:rPr>
-          <w:rFonts w:ascii="Arial" w:hAnsi="Arial" w:cs="Arial"/>
-          <w:sz w:val="20"/>
-          <w:szCs w:val="20"/>
-        </w:rPr>
-        <w:t xml:space="preserve"> yang </w:t>
-      </w:r>
-      <w:proofErr w:type="spellStart"/>
-      <w:r>
-        <w:rPr>
-          <w:rFonts w:ascii="Arial" w:hAnsi="Arial" w:cs="Arial"/>
-          <w:sz w:val="20"/>
-          <w:szCs w:val="20"/>
-        </w:rPr>
-        <w:t>berwenang</w:t>
-      </w:r>
-      <w:proofErr w:type="spellEnd"/>
-      <w:r>
-        <w:rPr>
-          <w:rFonts w:ascii="Arial" w:hAnsi="Arial" w:cs="Arial"/>
-          <w:sz w:val="20"/>
-          <w:szCs w:val="20"/>
-        </w:rPr>
-        <w:t xml:space="preserve"> </w:t>
-      </w:r>
-      <w:proofErr w:type="spellStart"/>
-      <w:r>
-        <w:rPr>
-          <w:rFonts w:ascii="Arial" w:hAnsi="Arial" w:cs="Arial"/>
-          <w:sz w:val="20"/>
-          <w:szCs w:val="20"/>
-        </w:rPr>
-        <w:t>menertibkan</w:t>
-      </w:r>
-      <w:proofErr w:type="spellEnd"/>
-      <w:r>
-        <w:rPr>
-          <w:rFonts w:ascii="Arial" w:hAnsi="Arial" w:cs="Arial"/>
-          <w:sz w:val="20"/>
-          <w:szCs w:val="20"/>
-        </w:rPr>
-        <w:t xml:space="preserve"> SPPD, </w:t>
-      </w:r>
-      <w:proofErr w:type="spellStart"/>
-      <w:r>
-        <w:rPr>
-          <w:rFonts w:ascii="Arial" w:hAnsi="Arial" w:cs="Arial"/>
-          <w:sz w:val="20"/>
-          <w:szCs w:val="20"/>
-        </w:rPr>
-        <w:t>pejabat</w:t>
-      </w:r>
-      <w:proofErr w:type="spellEnd"/>
-      <w:r>
-        <w:rPr>
-          <w:rFonts w:ascii="Arial" w:hAnsi="Arial" w:cs="Arial"/>
-          <w:sz w:val="20"/>
-          <w:szCs w:val="20"/>
-        </w:rPr>
-        <w:t xml:space="preserve"> yang </w:t>
-      </w:r>
-      <w:proofErr w:type="spellStart"/>
-      <w:r>
-        <w:rPr>
-          <w:rFonts w:ascii="Arial" w:hAnsi="Arial" w:cs="Arial"/>
-          <w:sz w:val="20"/>
-          <w:szCs w:val="20"/>
-        </w:rPr>
-        <w:t>mengesahkan</w:t>
-      </w:r>
-      <w:proofErr w:type="spellEnd"/>
-      <w:r>
-        <w:rPr>
-          <w:rFonts w:ascii="Arial" w:hAnsi="Arial" w:cs="Arial"/>
-          <w:sz w:val="20"/>
-          <w:szCs w:val="20"/>
-        </w:rPr>
-        <w:t xml:space="preserve"> </w:t>
-      </w:r>
-      <w:proofErr w:type="spellStart"/>
-      <w:r>
-        <w:rPr>
-          <w:rFonts w:ascii="Arial" w:hAnsi="Arial" w:cs="Arial"/>
-          <w:sz w:val="20"/>
-          <w:szCs w:val="20"/>
-        </w:rPr>
-        <w:t>tanggal</w:t>
-      </w:r>
-      <w:proofErr w:type="spellEnd"/>
-      <w:r>
-        <w:rPr>
-          <w:rFonts w:ascii="Arial" w:hAnsi="Arial" w:cs="Arial"/>
-          <w:sz w:val="20"/>
-          <w:szCs w:val="20"/>
-        </w:rPr>
-        <w:t xml:space="preserve"> </w:t>
-      </w:r>
-      <w:proofErr w:type="spellStart"/>
-      <w:r>
-        <w:rPr>
-          <w:rFonts w:ascii="Arial" w:hAnsi="Arial" w:cs="Arial"/>
-          <w:sz w:val="20"/>
-          <w:szCs w:val="20"/>
-        </w:rPr>
-        <w:t>keberangkatan</w:t>
-      </w:r>
-      <w:proofErr w:type="spellEnd"/>
-      <w:r>
-        <w:rPr>
-          <w:rFonts w:ascii="Arial" w:hAnsi="Arial" w:cs="Arial"/>
-          <w:sz w:val="20"/>
-          <w:szCs w:val="20"/>
-        </w:rPr>
-        <w:t xml:space="preserve"> dan </w:t>
-      </w:r>
-      <w:proofErr w:type="spellStart"/>
-      <w:r>
-        <w:rPr>
-          <w:rFonts w:ascii="Arial" w:hAnsi="Arial" w:cs="Arial"/>
-          <w:sz w:val="20"/>
-          <w:szCs w:val="20"/>
-        </w:rPr>
-        <w:t>tiba</w:t>
-      </w:r>
-      <w:proofErr w:type="spellEnd"/>
-      <w:r>
-        <w:rPr>
-          <w:rFonts w:ascii="Arial" w:hAnsi="Arial" w:cs="Arial"/>
-          <w:sz w:val="20"/>
-          <w:szCs w:val="20"/>
-        </w:rPr>
-        <w:t xml:space="preserve"> </w:t>
-      </w:r>
-      <w:proofErr w:type="spellStart"/>
-      <w:r>
-        <w:rPr>
-          <w:rFonts w:ascii="Arial" w:hAnsi="Arial" w:cs="Arial"/>
-          <w:sz w:val="20"/>
-          <w:szCs w:val="20"/>
-        </w:rPr>
-        <w:t>serta</w:t>
-      </w:r>
-      <w:proofErr w:type="spellEnd"/>
-      <w:r>
-        <w:rPr>
-          <w:rFonts w:ascii="Arial" w:hAnsi="Arial" w:cs="Arial"/>
-          <w:sz w:val="20"/>
-          <w:szCs w:val="20"/>
-        </w:rPr>
-        <w:t xml:space="preserve"> </w:t>
-      </w:r>
-      <w:proofErr w:type="spellStart"/>
-      <w:r>
-        <w:rPr>
-          <w:rFonts w:ascii="Arial" w:hAnsi="Arial" w:cs="Arial"/>
-          <w:sz w:val="20"/>
-          <w:szCs w:val="20"/>
-        </w:rPr>
-        <w:t>Bendahara</w:t>
-      </w:r>
-      <w:proofErr w:type="spellEnd"/>
-      <w:r>
-        <w:rPr>
-          <w:rFonts w:ascii="Arial" w:hAnsi="Arial" w:cs="Arial"/>
-          <w:sz w:val="20"/>
-          <w:szCs w:val="20"/>
-        </w:rPr>
-        <w:t xml:space="preserve"> </w:t>
-      </w:r>
-      <w:proofErr w:type="spellStart"/>
-      <w:r>
-        <w:rPr>
-          <w:rFonts w:ascii="Arial" w:hAnsi="Arial" w:cs="Arial"/>
-          <w:sz w:val="20"/>
-          <w:szCs w:val="20"/>
-        </w:rPr>
-        <w:t>Pengeluaran</w:t>
-      </w:r>
-      <w:proofErr w:type="spellEnd"/>
-      <w:r>
-        <w:rPr>
-          <w:rFonts w:ascii="Arial" w:hAnsi="Arial" w:cs="Arial"/>
-          <w:sz w:val="20"/>
-          <w:szCs w:val="20"/>
-        </w:rPr>
-        <w:t xml:space="preserve">, </w:t>
-      </w:r>
-      <w:proofErr w:type="spellStart"/>
-      <w:r>
-        <w:rPr>
-          <w:rFonts w:ascii="Arial" w:hAnsi="Arial" w:cs="Arial"/>
-          <w:sz w:val="20"/>
-          <w:szCs w:val="20"/>
-        </w:rPr>
-        <w:t>bertanggungjawab</w:t>
-      </w:r>
-      <w:proofErr w:type="spellEnd"/>
-      <w:r>
-        <w:rPr>
-          <w:rFonts w:ascii="Arial" w:hAnsi="Arial" w:cs="Arial"/>
-          <w:sz w:val="20"/>
-          <w:szCs w:val="20"/>
-        </w:rPr>
-        <w:t xml:space="preserve"> </w:t>
-      </w:r>
-      <w:proofErr w:type="spellStart"/>
-      <w:r>
-        <w:rPr>
-          <w:rFonts w:ascii="Arial" w:hAnsi="Arial" w:cs="Arial"/>
-          <w:sz w:val="20"/>
-          <w:szCs w:val="20"/>
-        </w:rPr>
-        <w:t>apabila</w:t>
-      </w:r>
-      <w:proofErr w:type="spellEnd"/>
-      <w:r>
-        <w:rPr>
-          <w:rFonts w:ascii="Arial" w:hAnsi="Arial" w:cs="Arial"/>
-          <w:sz w:val="20"/>
-          <w:szCs w:val="20"/>
-        </w:rPr>
-        <w:t xml:space="preserve"> </w:t>
-      </w:r>
-      <w:proofErr w:type="spellStart"/>
-      <w:r>
-        <w:rPr>
-          <w:rFonts w:ascii="Arial" w:hAnsi="Arial" w:cs="Arial"/>
-          <w:sz w:val="20"/>
-          <w:szCs w:val="20"/>
-        </w:rPr>
-        <w:t>daerah</w:t>
-      </w:r>
-      <w:proofErr w:type="spellEnd"/>
-      <w:r>
-        <w:rPr>
-          <w:rFonts w:ascii="Arial" w:hAnsi="Arial" w:cs="Arial"/>
-          <w:sz w:val="20"/>
-          <w:szCs w:val="20"/>
-        </w:rPr>
-        <w:t xml:space="preserve"> </w:t>
-      </w:r>
-      <w:proofErr w:type="spellStart"/>
-      <w:r>
-        <w:rPr>
-          <w:rFonts w:ascii="Arial" w:hAnsi="Arial" w:cs="Arial"/>
-          <w:sz w:val="20"/>
-          <w:szCs w:val="20"/>
-        </w:rPr>
-        <w:t>menderita</w:t>
-      </w:r>
-      <w:proofErr w:type="spellEnd"/>
-      <w:r>
-        <w:rPr>
-          <w:rFonts w:ascii="Arial" w:hAnsi="Arial" w:cs="Arial"/>
-          <w:sz w:val="20"/>
-          <w:szCs w:val="20"/>
-        </w:rPr>
-        <w:t xml:space="preserve"> </w:t>
-      </w:r>
-      <w:proofErr w:type="spellStart"/>
-      <w:r>
-        <w:rPr>
-          <w:rFonts w:ascii="Arial" w:hAnsi="Arial" w:cs="Arial"/>
-          <w:sz w:val="20"/>
-          <w:szCs w:val="20"/>
-        </w:rPr>
-        <w:t>kerugian</w:t>
-      </w:r>
-      <w:proofErr w:type="spellEnd"/>
-      <w:r>
-        <w:rPr>
-          <w:rFonts w:ascii="Arial" w:hAnsi="Arial" w:cs="Arial"/>
-          <w:sz w:val="20"/>
-          <w:szCs w:val="20"/>
-        </w:rPr>
-        <w:t xml:space="preserve"> </w:t>
-      </w:r>
-      <w:proofErr w:type="spellStart"/>
-      <w:r>
-        <w:rPr>
-          <w:rFonts w:ascii="Arial" w:hAnsi="Arial" w:cs="Arial"/>
-          <w:sz w:val="20"/>
-          <w:szCs w:val="20"/>
-        </w:rPr>
-        <w:t>keuangan</w:t>
-      </w:r>
-      <w:proofErr w:type="spellEnd"/>
-      <w:r>
-        <w:rPr>
-          <w:rFonts w:ascii="Arial" w:hAnsi="Arial" w:cs="Arial"/>
-          <w:sz w:val="20"/>
-          <w:szCs w:val="20"/>
-        </w:rPr>
-        <w:t xml:space="preserve"> </w:t>
-      </w:r>
-      <w:proofErr w:type="spellStart"/>
-      <w:r>
-        <w:rPr>
-          <w:rFonts w:ascii="Arial" w:hAnsi="Arial" w:cs="Arial"/>
-          <w:sz w:val="20"/>
-          <w:szCs w:val="20"/>
-        </w:rPr>
-        <w:t>akibat</w:t>
-      </w:r>
-      <w:proofErr w:type="spellEnd"/>
-      <w:r>
-        <w:rPr>
-          <w:rFonts w:ascii="Arial" w:hAnsi="Arial" w:cs="Arial"/>
-          <w:sz w:val="20"/>
-          <w:szCs w:val="20"/>
-        </w:rPr>
-        <w:t xml:space="preserve"> </w:t>
-      </w:r>
-      <w:proofErr w:type="spellStart"/>
-      <w:r>
-        <w:rPr>
-          <w:rFonts w:ascii="Arial" w:hAnsi="Arial" w:cs="Arial"/>
-          <w:sz w:val="20"/>
-          <w:szCs w:val="20"/>
-        </w:rPr>
-        <w:t>kesalahan</w:t>
-      </w:r>
-      <w:proofErr w:type="spellEnd"/>
-      <w:r>
-        <w:rPr>
-          <w:rFonts w:ascii="Arial" w:hAnsi="Arial" w:cs="Arial"/>
-          <w:sz w:val="20"/>
-          <w:szCs w:val="20"/>
-        </w:rPr>
-        <w:t xml:space="preserve">, </w:t>
-      </w:r>
-      <w:proofErr w:type="spellStart"/>
-      <w:r>
-        <w:rPr>
-          <w:rFonts w:ascii="Arial" w:hAnsi="Arial" w:cs="Arial"/>
-          <w:sz w:val="20"/>
-          <w:szCs w:val="20"/>
-        </w:rPr>
-        <w:t>kealpaan</w:t>
-      </w:r>
-      <w:proofErr w:type="spellEnd"/>
-      <w:r>
-        <w:rPr>
-          <w:rFonts w:ascii="Arial" w:hAnsi="Arial" w:cs="Arial"/>
-          <w:sz w:val="20"/>
-          <w:szCs w:val="20"/>
-        </w:rPr>
-        <w:t xml:space="preserve"> dan </w:t>
-      </w:r>
-      <w:proofErr w:type="spellStart"/>
-      <w:r>
-        <w:rPr>
-          <w:rFonts w:ascii="Arial" w:hAnsi="Arial" w:cs="Arial"/>
-          <w:sz w:val="20"/>
-          <w:szCs w:val="20"/>
-        </w:rPr>
-        <w:t>kelalaiannya</w:t>
-      </w:r>
-      <w:proofErr w:type="spellEnd"/>
-      <w:r>
-        <w:rPr>
-          <w:rFonts w:ascii="Arial" w:hAnsi="Arial" w:cs="Arial"/>
-          <w:sz w:val="20"/>
-          <w:szCs w:val="20"/>
-        </w:rPr>
-        <w:t xml:space="preserve"> </w:t>
-      </w:r>
-      <w:proofErr w:type="spellStart"/>
-      <w:r>
-        <w:rPr>
-          <w:rFonts w:ascii="Arial" w:hAnsi="Arial" w:cs="Arial"/>
-          <w:sz w:val="20"/>
-          <w:szCs w:val="20"/>
-        </w:rPr>
-        <w:t>berdasarkan</w:t>
-      </w:r>
-      <w:proofErr w:type="spellEnd"/>
-      <w:r>
-        <w:rPr>
-          <w:rFonts w:ascii="Arial" w:hAnsi="Arial" w:cs="Arial"/>
-          <w:sz w:val="20"/>
-          <w:szCs w:val="20"/>
-        </w:rPr>
-        <w:t xml:space="preserve"> </w:t>
-      </w:r>
-      <w:proofErr w:type="spellStart"/>
-      <w:r>
-        <w:rPr>
-          <w:rFonts w:ascii="Arial" w:hAnsi="Arial" w:cs="Arial"/>
-          <w:sz w:val="20"/>
-          <w:szCs w:val="20"/>
-        </w:rPr>
-        <w:t>peraturan</w:t>
-      </w:r>
-      <w:proofErr w:type="spellEnd"/>
-      <w:r>
-        <w:rPr>
-          <w:rFonts w:ascii="Arial" w:hAnsi="Arial" w:cs="Arial"/>
-          <w:sz w:val="20"/>
-          <w:szCs w:val="20"/>
-        </w:rPr>
-        <w:t xml:space="preserve"> </w:t>
-      </w:r>
-      <w:proofErr w:type="spellStart"/>
-      <w:r>
-        <w:rPr>
-          <w:rFonts w:ascii="Arial" w:hAnsi="Arial" w:cs="Arial"/>
-          <w:sz w:val="20"/>
-          <w:szCs w:val="20"/>
-        </w:rPr>
-        <w:t>perundang-undangan</w:t>
-      </w:r>
-      <w:proofErr w:type="spellEnd"/>
-      <w:r>
-        <w:rPr>
-          <w:rFonts w:ascii="Arial" w:hAnsi="Arial" w:cs="Arial"/>
-          <w:sz w:val="20"/>
-          <w:szCs w:val="20"/>
-        </w:rPr>
-        <w:t>.</w:t>
+        <w:t>Pejabat yang berwenang menertibkan SPPD, pejabat yang mengesahkan tanggal keberangkatan dan tiba serta Bendahara Pengeluaran, bertanggungjawab apabila daerah menderita kerugian keuangan akibat kesalahan, kealpaan dan kelalaiannya berdasarkan peraturan perundang-undangan.</w:t>
       </w:r>
     </w:p>
     <w:sectPr>

</xml_diff>